<commit_message>
Document CPU embedding fine-tuning results
</commit_message>
<xml_diff>
--- a/deliverables/Turkish_Legal_RAG_Final_Report.docx
+++ b/deliverables/Turkish_Legal_RAG_Final_Report.docx
@@ -1881,7 +1881,7 @@
         <w:pStyle w:val="Heading2"/>
       </w:pPr>
       <w:r>
-        <w:t>6.3 Embedding Tuning Smoke Test</w:t>
+        <w:t>6.3 Embedding Tuning Experiment</w:t>
       </w:r>
     </w:p>
     <w:p>
@@ -1908,7 +1908,7 @@
     </w:p>
     <w:p>
       <w:r>
-        <w:t>A small CPU smoke test used only 64 triples to verify the training and evaluation workflow. It is not a final optimized embedding result.</w:t>
+        <w:t>First, a small CPU smoke test used only 64 triples to verify the training and evaluation workflow.</w:t>
       </w:r>
     </w:p>
     <w:tbl>
@@ -2305,7 +2305,414 @@
     <w:p/>
     <w:p>
       <w:r>
-        <w:t>The smoke run confirms that the training pipeline works end to end. Full training should be run on all 2,059 triples with GPU support.</w:t>
+        <w:t>The smoke run confirmed that the training pipeline works end to end.</w:t>
+      </w:r>
+    </w:p>
+    <w:p>
+      <w:r>
+        <w:t>A full CPU fine-tuning run was then executed using all 2,059 embedding triples. The local PyTorch installation did not expose a CUDA device, so the run used `batch_size=4`, `max_seq_length=256`, and one epoch. Training took 2,471 seconds and reached training loss 3.257.</w:t>
+      </w:r>
+    </w:p>
+    <w:p>
+      <w:r>
+        <w:t>Full benchmark evaluation:</w:t>
+      </w:r>
+    </w:p>
+    <w:tbl>
+      <w:tblPr>
+        <w:tblStyle w:val="TableGrid"/>
+        <w:tblW w:type="auto" w:w="0"/>
+        <w:jc w:val="center"/>
+        <w:tblLook w:firstColumn="1" w:firstRow="1" w:lastColumn="0" w:lastRow="0" w:noHBand="0" w:noVBand="1" w:val="04A0"/>
+      </w:tblPr>
+      <w:tblGrid>
+        <w:gridCol w:w="1872"/>
+        <w:gridCol w:w="1872"/>
+        <w:gridCol w:w="1872"/>
+        <w:gridCol w:w="1872"/>
+        <w:gridCol w:w="1872"/>
+      </w:tblGrid>
+      <w:tr>
+        <w:tc>
+          <w:tcPr>
+            <w:tcW w:type="dxa" w:w="1872"/>
+            <w:vAlign w:val="center"/>
+            <w:tcMar>
+              <w:top w:w="80" w:type="dxa"/>
+              <w:start w:w="120" w:type="dxa"/>
+              <w:bottom w:w="80" w:type="dxa"/>
+              <w:end w:w="120" w:type="dxa"/>
+            </w:tcMar>
+            <w:shd w:fill="F2F4F7"/>
+          </w:tcPr>
+          <w:p>
+            <w:pPr>
+              <w:spacing w:after="0"/>
+            </w:pPr>
+            <w:r>
+              <w:rPr>
+                <w:rFonts w:ascii="Calibri" w:hAnsi="Calibri"/>
+                <w:b/>
+                <w:sz w:val="18"/>
+              </w:rPr>
+              <w:t>Dense model</w:t>
+            </w:r>
+          </w:p>
+        </w:tc>
+        <w:tc>
+          <w:tcPr>
+            <w:tcW w:type="dxa" w:w="1872"/>
+            <w:vAlign w:val="center"/>
+            <w:tcMar>
+              <w:top w:w="80" w:type="dxa"/>
+              <w:start w:w="120" w:type="dxa"/>
+              <w:bottom w:w="80" w:type="dxa"/>
+              <w:end w:w="120" w:type="dxa"/>
+            </w:tcMar>
+            <w:shd w:fill="F2F4F7"/>
+          </w:tcPr>
+          <w:p>
+            <w:pPr>
+              <w:spacing w:after="0"/>
+            </w:pPr>
+            <w:r>
+              <w:rPr>
+                <w:rFonts w:ascii="Calibri" w:hAnsi="Calibri"/>
+                <w:b/>
+                <w:sz w:val="18"/>
+              </w:rPr>
+              <w:t>Recall@5</w:t>
+            </w:r>
+          </w:p>
+        </w:tc>
+        <w:tc>
+          <w:tcPr>
+            <w:tcW w:type="dxa" w:w="1872"/>
+            <w:vAlign w:val="center"/>
+            <w:tcMar>
+              <w:top w:w="80" w:type="dxa"/>
+              <w:start w:w="120" w:type="dxa"/>
+              <w:bottom w:w="80" w:type="dxa"/>
+              <w:end w:w="120" w:type="dxa"/>
+            </w:tcMar>
+            <w:shd w:fill="F2F4F7"/>
+          </w:tcPr>
+          <w:p>
+            <w:pPr>
+              <w:spacing w:after="0"/>
+            </w:pPr>
+            <w:r>
+              <w:rPr>
+                <w:rFonts w:ascii="Calibri" w:hAnsi="Calibri"/>
+                <w:b/>
+                <w:sz w:val="18"/>
+              </w:rPr>
+              <w:t>Recall@10</w:t>
+            </w:r>
+          </w:p>
+        </w:tc>
+        <w:tc>
+          <w:tcPr>
+            <w:tcW w:type="dxa" w:w="1872"/>
+            <w:vAlign w:val="center"/>
+            <w:tcMar>
+              <w:top w:w="80" w:type="dxa"/>
+              <w:start w:w="120" w:type="dxa"/>
+              <w:bottom w:w="80" w:type="dxa"/>
+              <w:end w:w="120" w:type="dxa"/>
+            </w:tcMar>
+            <w:shd w:fill="F2F4F7"/>
+          </w:tcPr>
+          <w:p>
+            <w:pPr>
+              <w:spacing w:after="0"/>
+            </w:pPr>
+            <w:r>
+              <w:rPr>
+                <w:rFonts w:ascii="Calibri" w:hAnsi="Calibri"/>
+                <w:b/>
+                <w:sz w:val="18"/>
+              </w:rPr>
+              <w:t>MRR</w:t>
+            </w:r>
+          </w:p>
+        </w:tc>
+        <w:tc>
+          <w:tcPr>
+            <w:tcW w:type="dxa" w:w="1872"/>
+            <w:vAlign w:val="center"/>
+            <w:tcMar>
+              <w:top w:w="80" w:type="dxa"/>
+              <w:start w:w="120" w:type="dxa"/>
+              <w:bottom w:w="80" w:type="dxa"/>
+              <w:end w:w="120" w:type="dxa"/>
+            </w:tcMar>
+            <w:shd w:fill="F2F4F7"/>
+          </w:tcPr>
+          <w:p>
+            <w:pPr>
+              <w:spacing w:after="0"/>
+            </w:pPr>
+            <w:r>
+              <w:rPr>
+                <w:rFonts w:ascii="Calibri" w:hAnsi="Calibri"/>
+                <w:b/>
+                <w:sz w:val="18"/>
+              </w:rPr>
+              <w:t>nDCG@10</w:t>
+            </w:r>
+          </w:p>
+        </w:tc>
+      </w:tr>
+      <w:tr>
+        <w:tc>
+          <w:tcPr>
+            <w:tcW w:type="dxa" w:w="1872"/>
+            <w:vAlign w:val="center"/>
+            <w:tcMar>
+              <w:top w:w="80" w:type="dxa"/>
+              <w:start w:w="120" w:type="dxa"/>
+              <w:bottom w:w="80" w:type="dxa"/>
+              <w:end w:w="120" w:type="dxa"/>
+            </w:tcMar>
+          </w:tcPr>
+          <w:p>
+            <w:pPr>
+              <w:spacing w:after="0"/>
+            </w:pPr>
+            <w:r>
+              <w:rPr>
+                <w:rFonts w:ascii="Calibri" w:hAnsi="Calibri"/>
+                <w:sz w:val="18"/>
+              </w:rPr>
+              <w:t>Base multilingual MiniLM</w:t>
+            </w:r>
+          </w:p>
+        </w:tc>
+        <w:tc>
+          <w:tcPr>
+            <w:tcW w:type="dxa" w:w="1872"/>
+            <w:vAlign w:val="center"/>
+            <w:tcMar>
+              <w:top w:w="80" w:type="dxa"/>
+              <w:start w:w="120" w:type="dxa"/>
+              <w:bottom w:w="80" w:type="dxa"/>
+              <w:end w:w="120" w:type="dxa"/>
+            </w:tcMar>
+          </w:tcPr>
+          <w:p>
+            <w:pPr>
+              <w:spacing w:after="0"/>
+            </w:pPr>
+            <w:r>
+              <w:rPr>
+                <w:rFonts w:ascii="Calibri" w:hAnsi="Calibri"/>
+                <w:sz w:val="18"/>
+              </w:rPr>
+              <w:t>0.613</w:t>
+            </w:r>
+          </w:p>
+        </w:tc>
+        <w:tc>
+          <w:tcPr>
+            <w:tcW w:type="dxa" w:w="1872"/>
+            <w:vAlign w:val="center"/>
+            <w:tcMar>
+              <w:top w:w="80" w:type="dxa"/>
+              <w:start w:w="120" w:type="dxa"/>
+              <w:bottom w:w="80" w:type="dxa"/>
+              <w:end w:w="120" w:type="dxa"/>
+            </w:tcMar>
+          </w:tcPr>
+          <w:p>
+            <w:pPr>
+              <w:spacing w:after="0"/>
+            </w:pPr>
+            <w:r>
+              <w:rPr>
+                <w:rFonts w:ascii="Calibri" w:hAnsi="Calibri"/>
+                <w:sz w:val="18"/>
+              </w:rPr>
+              <w:t>0.676</w:t>
+            </w:r>
+          </w:p>
+        </w:tc>
+        <w:tc>
+          <w:tcPr>
+            <w:tcW w:type="dxa" w:w="1872"/>
+            <w:vAlign w:val="center"/>
+            <w:tcMar>
+              <w:top w:w="80" w:type="dxa"/>
+              <w:start w:w="120" w:type="dxa"/>
+              <w:bottom w:w="80" w:type="dxa"/>
+              <w:end w:w="120" w:type="dxa"/>
+            </w:tcMar>
+          </w:tcPr>
+          <w:p>
+            <w:pPr>
+              <w:spacing w:after="0"/>
+            </w:pPr>
+            <w:r>
+              <w:rPr>
+                <w:rFonts w:ascii="Calibri" w:hAnsi="Calibri"/>
+                <w:sz w:val="18"/>
+              </w:rPr>
+              <w:t>0.518</w:t>
+            </w:r>
+          </w:p>
+        </w:tc>
+        <w:tc>
+          <w:tcPr>
+            <w:tcW w:type="dxa" w:w="1872"/>
+            <w:vAlign w:val="center"/>
+            <w:tcMar>
+              <w:top w:w="80" w:type="dxa"/>
+              <w:start w:w="120" w:type="dxa"/>
+              <w:bottom w:w="80" w:type="dxa"/>
+              <w:end w:w="120" w:type="dxa"/>
+            </w:tcMar>
+          </w:tcPr>
+          <w:p>
+            <w:pPr>
+              <w:spacing w:after="0"/>
+            </w:pPr>
+            <w:r>
+              <w:rPr>
+                <w:rFonts w:ascii="Calibri" w:hAnsi="Calibri"/>
+                <w:sz w:val="18"/>
+              </w:rPr>
+              <w:t>0.556</w:t>
+            </w:r>
+          </w:p>
+        </w:tc>
+      </w:tr>
+      <w:tr>
+        <w:tc>
+          <w:tcPr>
+            <w:tcW w:type="dxa" w:w="1872"/>
+            <w:vAlign w:val="center"/>
+            <w:tcMar>
+              <w:top w:w="80" w:type="dxa"/>
+              <w:start w:w="120" w:type="dxa"/>
+              <w:bottom w:w="80" w:type="dxa"/>
+              <w:end w:w="120" w:type="dxa"/>
+            </w:tcMar>
+          </w:tcPr>
+          <w:p>
+            <w:pPr>
+              <w:spacing w:after="0"/>
+            </w:pPr>
+            <w:r>
+              <w:rPr>
+                <w:rFonts w:ascii="Calibri" w:hAnsi="Calibri"/>
+                <w:sz w:val="18"/>
+              </w:rPr>
+              <w:t>CPU triplet fine-tuned model</w:t>
+            </w:r>
+          </w:p>
+        </w:tc>
+        <w:tc>
+          <w:tcPr>
+            <w:tcW w:type="dxa" w:w="1872"/>
+            <w:vAlign w:val="center"/>
+            <w:tcMar>
+              <w:top w:w="80" w:type="dxa"/>
+              <w:start w:w="120" w:type="dxa"/>
+              <w:bottom w:w="80" w:type="dxa"/>
+              <w:end w:w="120" w:type="dxa"/>
+            </w:tcMar>
+          </w:tcPr>
+          <w:p>
+            <w:pPr>
+              <w:spacing w:after="0"/>
+            </w:pPr>
+            <w:r>
+              <w:rPr>
+                <w:rFonts w:ascii="Calibri" w:hAnsi="Calibri"/>
+                <w:sz w:val="18"/>
+              </w:rPr>
+              <w:t>0.539</w:t>
+            </w:r>
+          </w:p>
+        </w:tc>
+        <w:tc>
+          <w:tcPr>
+            <w:tcW w:type="dxa" w:w="1872"/>
+            <w:vAlign w:val="center"/>
+            <w:tcMar>
+              <w:top w:w="80" w:type="dxa"/>
+              <w:start w:w="120" w:type="dxa"/>
+              <w:bottom w:w="80" w:type="dxa"/>
+              <w:end w:w="120" w:type="dxa"/>
+            </w:tcMar>
+          </w:tcPr>
+          <w:p>
+            <w:pPr>
+              <w:spacing w:after="0"/>
+            </w:pPr>
+            <w:r>
+              <w:rPr>
+                <w:rFonts w:ascii="Calibri" w:hAnsi="Calibri"/>
+                <w:sz w:val="18"/>
+              </w:rPr>
+              <w:t>0.591</w:t>
+            </w:r>
+          </w:p>
+        </w:tc>
+        <w:tc>
+          <w:tcPr>
+            <w:tcW w:type="dxa" w:w="1872"/>
+            <w:vAlign w:val="center"/>
+            <w:tcMar>
+              <w:top w:w="80" w:type="dxa"/>
+              <w:start w:w="120" w:type="dxa"/>
+              <w:bottom w:w="80" w:type="dxa"/>
+              <w:end w:w="120" w:type="dxa"/>
+            </w:tcMar>
+          </w:tcPr>
+          <w:p>
+            <w:pPr>
+              <w:spacing w:after="0"/>
+            </w:pPr>
+            <w:r>
+              <w:rPr>
+                <w:rFonts w:ascii="Calibri" w:hAnsi="Calibri"/>
+                <w:sz w:val="18"/>
+              </w:rPr>
+              <w:t>0.456</w:t>
+            </w:r>
+          </w:p>
+        </w:tc>
+        <w:tc>
+          <w:tcPr>
+            <w:tcW w:type="dxa" w:w="1872"/>
+            <w:vAlign w:val="center"/>
+            <w:tcMar>
+              <w:top w:w="80" w:type="dxa"/>
+              <w:start w:w="120" w:type="dxa"/>
+              <w:bottom w:w="80" w:type="dxa"/>
+              <w:end w:w="120" w:type="dxa"/>
+            </w:tcMar>
+          </w:tcPr>
+          <w:p>
+            <w:pPr>
+              <w:spacing w:after="0"/>
+            </w:pPr>
+            <w:r>
+              <w:rPr>
+                <w:rFonts w:ascii="Calibri" w:hAnsi="Calibri"/>
+                <w:sz w:val="18"/>
+              </w:rPr>
+              <w:t>0.488</w:t>
+            </w:r>
+          </w:p>
+        </w:tc>
+      </w:tr>
+    </w:tbl>
+    <w:p/>
+    <w:p>
+      <w:r>
+        <w:t>The full CPU fine-tuning run degraded dense retrieval quality. This is an important ablation result: fine-tuning is not automatically beneficial, especially when the base model, negative sampling, objective, sequence length, and validation strategy are not tuned for Turkish legal retrieval. Therefore, the final demo system keeps BM25 as the primary retriever.</w:t>
       </w:r>
     </w:p>
     <w:p>
@@ -2890,7 +3297,7 @@
     </w:p>
     <w:p>
       <w:r>
-        <w:t>The local environment used for these experiments is CPU-only. CUDA is not available. Because of this, full cross-encoder fine-tuning and large LLM fine-tuning were prepared as reproducible scripts but not fully executed locally.</w:t>
+        <w:t>The local environment used for these experiments is CPU-only. CUDA is not available. Because of this, full embedding fine-tuning was run with a smaller CPU configuration, while full cross-encoder fine-tuning and large LLM fine-tuning were prepared as reproducible scripts but not fully executed locally.</w:t>
       </w:r>
     </w:p>
     <w:p>
@@ -2919,7 +3326,15 @@
         <w:pStyle w:val="ListBullet"/>
       </w:pPr>
       <w:r>
-        <w:t>Full embedding and reranker fine-tuning should be run on GPU.</w:t>
+        <w:t>CPU embedding fine-tuning degraded dense retrieval, so the final demo uses BM25.</w:t>
+      </w:r>
+    </w:p>
+    <w:p>
+      <w:pPr>
+        <w:pStyle w:val="ListBullet"/>
+      </w:pPr>
+      <w:r>
+        <w:t>Full reranker and LLM fine-tuning should be run on GPU.</w:t>
       </w:r>
     </w:p>
     <w:p>
@@ -2950,7 +3365,7 @@
     </w:p>
     <w:p>
       <w:r>
-        <w:t>The experiments also reveal clear optimization directions. Generic dense embeddings underperform lexical retrieval, and a pretrained general-domain reranker hurts performance. Therefore, domain adaptation through embedding fine-tuning and reranker fine-tuning is necessary for the optimized final system.</w:t>
+        <w:t>The experiments also reveal clear optimization directions. Generic dense embeddings underperform lexical retrieval, a naive CPU triplet fine-tuning run further degrades dense retrieval, and a pretrained general-domain reranker hurts performance. Therefore, future optimized systems should use carefully validated domain adaptation rather than assuming that fine-tuning alone will improve the pipeline.</w:t>
       </w:r>
     </w:p>
     <w:sectPr>

</xml_diff>

<commit_message>
Add judge-based faithfulness evaluation
</commit_message>
<xml_diff>
--- a/deliverables/Turkish_Legal_RAG_Final_Report.docx
+++ b/deliverables/Turkish_Legal_RAG_Final_Report.docx
@@ -3158,6 +3158,311 @@
     </w:p>
     <w:p>
       <w:pPr>
+        <w:pStyle w:val="Heading2"/>
+      </w:pPr>
+      <w:r>
+        <w:t>6.5 LLM/NLI Judge Faithfulness</w:t>
+      </w:r>
+    </w:p>
+    <w:p>
+      <w:r>
+        <w:t>To add a semantic grounding check beyond token overlap, a judge-based faithfulness evaluator was implemented in `scripts/evaluate_llm_judge.py`. The script supports an optional API-based LLM judge, a local FLAN-T5 judge, and a local multilingual NLI judge. Because no API key was available and FLAN-T5-small was unreliable for Turkish legal text, the final run used:</w:t>
+      </w:r>
+    </w:p>
+    <w:p>
+      <w:pPr>
+        <w:pStyle w:val="NoSpacing"/>
+      </w:pPr>
+      <w:r>
+        <w:rPr>
+          <w:rFonts w:ascii="Consolas" w:hAnsi="Consolas"/>
+          <w:sz w:val="18"/>
+        </w:rPr>
+        <w:t>MoritzLaurer/multilingual-MiniLMv2-L6-mnli-xnli</w:t>
+      </w:r>
+    </w:p>
+    <w:p>
+      <w:r>
+        <w:t>The judge compares each generated answer against the top retrieved source text and predicts whether the answer is entailed by that source.</w:t>
+      </w:r>
+    </w:p>
+    <w:tbl>
+      <w:tblPr>
+        <w:tblStyle w:val="TableGrid"/>
+        <w:tblW w:type="auto" w:w="0"/>
+        <w:jc w:val="center"/>
+        <w:tblLook w:firstColumn="1" w:firstRow="1" w:lastColumn="0" w:lastRow="0" w:noHBand="0" w:noVBand="1" w:val="04A0"/>
+      </w:tblPr>
+      <w:tblGrid>
+        <w:gridCol w:w="1872"/>
+        <w:gridCol w:w="1872"/>
+        <w:gridCol w:w="1872"/>
+        <w:gridCol w:w="1872"/>
+        <w:gridCol w:w="1872"/>
+      </w:tblGrid>
+      <w:tr>
+        <w:tc>
+          <w:tcPr>
+            <w:tcW w:type="dxa" w:w="1872"/>
+            <w:vAlign w:val="center"/>
+            <w:tcMar>
+              <w:top w:w="80" w:type="dxa"/>
+              <w:start w:w="120" w:type="dxa"/>
+              <w:bottom w:w="80" w:type="dxa"/>
+              <w:end w:w="120" w:type="dxa"/>
+            </w:tcMar>
+            <w:shd w:fill="F2F4F7"/>
+          </w:tcPr>
+          <w:p>
+            <w:pPr>
+              <w:spacing w:after="0"/>
+            </w:pPr>
+            <w:r>
+              <w:rPr>
+                <w:rFonts w:ascii="Calibri" w:hAnsi="Calibri"/>
+                <w:b/>
+                <w:sz w:val="18"/>
+              </w:rPr>
+              <w:t>Judge</w:t>
+            </w:r>
+          </w:p>
+        </w:tc>
+        <w:tc>
+          <w:tcPr>
+            <w:tcW w:type="dxa" w:w="1872"/>
+            <w:vAlign w:val="center"/>
+            <w:tcMar>
+              <w:top w:w="80" w:type="dxa"/>
+              <w:start w:w="120" w:type="dxa"/>
+              <w:bottom w:w="80" w:type="dxa"/>
+              <w:end w:w="120" w:type="dxa"/>
+            </w:tcMar>
+            <w:shd w:fill="F2F4F7"/>
+          </w:tcPr>
+          <w:p>
+            <w:pPr>
+              <w:spacing w:after="0"/>
+            </w:pPr>
+            <w:r>
+              <w:rPr>
+                <w:rFonts w:ascii="Calibri" w:hAnsi="Calibri"/>
+                <w:b/>
+                <w:sz w:val="18"/>
+              </w:rPr>
+              <w:t>Examples</w:t>
+            </w:r>
+          </w:p>
+        </w:tc>
+        <w:tc>
+          <w:tcPr>
+            <w:tcW w:type="dxa" w:w="1872"/>
+            <w:vAlign w:val="center"/>
+            <w:tcMar>
+              <w:top w:w="80" w:type="dxa"/>
+              <w:start w:w="120" w:type="dxa"/>
+              <w:bottom w:w="80" w:type="dxa"/>
+              <w:end w:w="120" w:type="dxa"/>
+            </w:tcMar>
+            <w:shd w:fill="F2F4F7"/>
+          </w:tcPr>
+          <w:p>
+            <w:pPr>
+              <w:spacing w:after="0"/>
+            </w:pPr>
+            <w:r>
+              <w:rPr>
+                <w:rFonts w:ascii="Calibri" w:hAnsi="Calibri"/>
+                <w:b/>
+                <w:sz w:val="18"/>
+              </w:rPr>
+              <w:t>Supported</w:t>
+            </w:r>
+          </w:p>
+        </w:tc>
+        <w:tc>
+          <w:tcPr>
+            <w:tcW w:type="dxa" w:w="1872"/>
+            <w:vAlign w:val="center"/>
+            <w:tcMar>
+              <w:top w:w="80" w:type="dxa"/>
+              <w:start w:w="120" w:type="dxa"/>
+              <w:bottom w:w="80" w:type="dxa"/>
+              <w:end w:w="120" w:type="dxa"/>
+            </w:tcMar>
+            <w:shd w:fill="F2F4F7"/>
+          </w:tcPr>
+          <w:p>
+            <w:pPr>
+              <w:spacing w:after="0"/>
+            </w:pPr>
+            <w:r>
+              <w:rPr>
+                <w:rFonts w:ascii="Calibri" w:hAnsi="Calibri"/>
+                <w:b/>
+                <w:sz w:val="18"/>
+              </w:rPr>
+              <w:t>Rejected</w:t>
+            </w:r>
+          </w:p>
+        </w:tc>
+        <w:tc>
+          <w:tcPr>
+            <w:tcW w:type="dxa" w:w="1872"/>
+            <w:vAlign w:val="center"/>
+            <w:tcMar>
+              <w:top w:w="80" w:type="dxa"/>
+              <w:start w:w="120" w:type="dxa"/>
+              <w:bottom w:w="80" w:type="dxa"/>
+              <w:end w:w="120" w:type="dxa"/>
+            </w:tcMar>
+            <w:shd w:fill="F2F4F7"/>
+          </w:tcPr>
+          <w:p>
+            <w:pPr>
+              <w:spacing w:after="0"/>
+            </w:pPr>
+            <w:r>
+              <w:rPr>
+                <w:rFonts w:ascii="Calibri" w:hAnsi="Calibri"/>
+                <w:b/>
+                <w:sz w:val="18"/>
+              </w:rPr>
+              <w:t>Faithfulness</w:t>
+            </w:r>
+          </w:p>
+        </w:tc>
+      </w:tr>
+      <w:tr>
+        <w:tc>
+          <w:tcPr>
+            <w:tcW w:type="dxa" w:w="1872"/>
+            <w:vAlign w:val="center"/>
+            <w:tcMar>
+              <w:top w:w="80" w:type="dxa"/>
+              <w:start w:w="120" w:type="dxa"/>
+              <w:bottom w:w="80" w:type="dxa"/>
+              <w:end w:w="120" w:type="dxa"/>
+            </w:tcMar>
+          </w:tcPr>
+          <w:p>
+            <w:pPr>
+              <w:spacing w:after="0"/>
+            </w:pPr>
+            <w:r>
+              <w:rPr>
+                <w:rFonts w:ascii="Calibri" w:hAnsi="Calibri"/>
+                <w:sz w:val="18"/>
+              </w:rPr>
+              <w:t>Multilingual NLI judge</w:t>
+            </w:r>
+          </w:p>
+        </w:tc>
+        <w:tc>
+          <w:tcPr>
+            <w:tcW w:type="dxa" w:w="1872"/>
+            <w:vAlign w:val="center"/>
+            <w:tcMar>
+              <w:top w:w="80" w:type="dxa"/>
+              <w:start w:w="120" w:type="dxa"/>
+              <w:bottom w:w="80" w:type="dxa"/>
+              <w:end w:w="120" w:type="dxa"/>
+            </w:tcMar>
+          </w:tcPr>
+          <w:p>
+            <w:pPr>
+              <w:spacing w:after="0"/>
+            </w:pPr>
+            <w:r>
+              <w:rPr>
+                <w:rFonts w:ascii="Calibri" w:hAnsi="Calibri"/>
+                <w:sz w:val="18"/>
+              </w:rPr>
+              <w:t>240</w:t>
+            </w:r>
+          </w:p>
+        </w:tc>
+        <w:tc>
+          <w:tcPr>
+            <w:tcW w:type="dxa" w:w="1872"/>
+            <w:vAlign w:val="center"/>
+            <w:tcMar>
+              <w:top w:w="80" w:type="dxa"/>
+              <w:start w:w="120" w:type="dxa"/>
+              <w:bottom w:w="80" w:type="dxa"/>
+              <w:end w:w="120" w:type="dxa"/>
+            </w:tcMar>
+          </w:tcPr>
+          <w:p>
+            <w:pPr>
+              <w:spacing w:after="0"/>
+            </w:pPr>
+            <w:r>
+              <w:rPr>
+                <w:rFonts w:ascii="Calibri" w:hAnsi="Calibri"/>
+                <w:sz w:val="18"/>
+              </w:rPr>
+              <w:t>206</w:t>
+            </w:r>
+          </w:p>
+        </w:tc>
+        <w:tc>
+          <w:tcPr>
+            <w:tcW w:type="dxa" w:w="1872"/>
+            <w:vAlign w:val="center"/>
+            <w:tcMar>
+              <w:top w:w="80" w:type="dxa"/>
+              <w:start w:w="120" w:type="dxa"/>
+              <w:bottom w:w="80" w:type="dxa"/>
+              <w:end w:w="120" w:type="dxa"/>
+            </w:tcMar>
+          </w:tcPr>
+          <w:p>
+            <w:pPr>
+              <w:spacing w:after="0"/>
+            </w:pPr>
+            <w:r>
+              <w:rPr>
+                <w:rFonts w:ascii="Calibri" w:hAnsi="Calibri"/>
+                <w:sz w:val="18"/>
+              </w:rPr>
+              <w:t>34</w:t>
+            </w:r>
+          </w:p>
+        </w:tc>
+        <w:tc>
+          <w:tcPr>
+            <w:tcW w:type="dxa" w:w="1872"/>
+            <w:vAlign w:val="center"/>
+            <w:tcMar>
+              <w:top w:w="80" w:type="dxa"/>
+              <w:start w:w="120" w:type="dxa"/>
+              <w:bottom w:w="80" w:type="dxa"/>
+              <w:end w:w="120" w:type="dxa"/>
+            </w:tcMar>
+          </w:tcPr>
+          <w:p>
+            <w:pPr>
+              <w:spacing w:after="0"/>
+            </w:pPr>
+            <w:r>
+              <w:rPr>
+                <w:rFonts w:ascii="Calibri" w:hAnsi="Calibri"/>
+                <w:sz w:val="18"/>
+              </w:rPr>
+              <w:t>0.858</w:t>
+            </w:r>
+          </w:p>
+        </w:tc>
+      </w:tr>
+    </w:tbl>
+    <w:p/>
+    <w:p>
+      <w:r>
+        <w:t>The judge score is lower than the lexical proxy, which is expected because semantic entailment is stricter than token overlap. It still indicates that most generated answers are grounded in the retrieved source.</w:t>
+      </w:r>
+    </w:p>
+    <w:p>
+      <w:pPr>
         <w:pStyle w:val="Heading1"/>
       </w:pPr>
       <w:r>
@@ -3264,6 +3569,8 @@
         <w:t>python scripts/evaluate_retrieval.py --retriever hybrid --dense-weight 0.35 --top-k 10 --output outputs/retrieval_eval_hybrid_full.json</w:t>
         <w:br/>
         <w:t>python scripts/evaluate_qa.py --retriever bm25 --generation-mode extractive --top-k 5 --output outputs/qa_eval_extractive_bm25_full.json</w:t>
+        <w:br/>
+        <w:t>python scripts/evaluate_llm_judge.py --input outputs/qa_eval_extractive_bm25_full.json --provider nli --output outputs/nli_judge_faithfulness_full.json</w:t>
         <w:br/>
         <w:t>python scripts/analyze_qa_errors.py --input outputs/qa_eval_extractive_bm25_full.json --output outputs/qa_error_analysis.md</w:t>
       </w:r>

</xml_diff>

<commit_message>
Add CPU reranker fine-tuning results
</commit_message>
<xml_diff>
--- a/deliverables/Turkish_Legal_RAG_Final_Report.docx
+++ b/deliverables/Turkish_Legal_RAG_Final_Report.docx
@@ -1437,7 +1437,7 @@
         <w:pStyle w:val="Heading2"/>
       </w:pPr>
       <w:r>
-        <w:t>6.2 Pretrained Reranker Experiment</w:t>
+        <w:t>6.2 Reranker Experiments</w:t>
       </w:r>
     </w:p>
     <w:p>
@@ -1874,6 +1874,488 @@
     <w:p>
       <w:r>
         <w:t>The pretrained reranker hurts performance. This indicates domain mismatch: the reranker was trained for general passage ranking, not Turkish legal ranking. This result supports the requirement for cross-encoder fine-tuning using `reranker.jsonl`.</w:t>
+      </w:r>
+    </w:p>
+    <w:p>
+      <w:r>
+        <w:t>A full CPU fine-tuning run was then performed on all 6,752 rows of `reranker.jsonl` using one epoch, batch size 4, and max sequence length 128. Training took 3,047 seconds and reached training loss 0.358.</w:t>
+      </w:r>
+    </w:p>
+    <w:p>
+      <w:r>
+        <w:t>Full benchmark evaluation:</w:t>
+      </w:r>
+    </w:p>
+    <w:tbl>
+      <w:tblPr>
+        <w:tblStyle w:val="TableGrid"/>
+        <w:tblW w:type="auto" w:w="0"/>
+        <w:jc w:val="center"/>
+        <w:tblLook w:firstColumn="1" w:firstRow="1" w:lastColumn="0" w:lastRow="0" w:noHBand="0" w:noVBand="1" w:val="04A0"/>
+      </w:tblPr>
+      <w:tblGrid>
+        <w:gridCol w:w="1560"/>
+        <w:gridCol w:w="1560"/>
+        <w:gridCol w:w="1560"/>
+        <w:gridCol w:w="1560"/>
+        <w:gridCol w:w="1560"/>
+        <w:gridCol w:w="1560"/>
+      </w:tblGrid>
+      <w:tr>
+        <w:tc>
+          <w:tcPr>
+            <w:tcW w:type="dxa" w:w="1560"/>
+            <w:vAlign w:val="center"/>
+            <w:tcMar>
+              <w:top w:w="80" w:type="dxa"/>
+              <w:start w:w="120" w:type="dxa"/>
+              <w:bottom w:w="80" w:type="dxa"/>
+              <w:end w:w="120" w:type="dxa"/>
+            </w:tcMar>
+            <w:shd w:fill="F2F4F7"/>
+          </w:tcPr>
+          <w:p>
+            <w:pPr>
+              <w:spacing w:after="0"/>
+            </w:pPr>
+            <w:r>
+              <w:rPr>
+                <w:rFonts w:ascii="Calibri" w:hAnsi="Calibri"/>
+                <w:b/>
+                <w:sz w:val="18"/>
+              </w:rPr>
+              <w:t>System</w:t>
+            </w:r>
+          </w:p>
+        </w:tc>
+        <w:tc>
+          <w:tcPr>
+            <w:tcW w:type="dxa" w:w="1560"/>
+            <w:vAlign w:val="center"/>
+            <w:tcMar>
+              <w:top w:w="80" w:type="dxa"/>
+              <w:start w:w="120" w:type="dxa"/>
+              <w:bottom w:w="80" w:type="dxa"/>
+              <w:end w:w="120" w:type="dxa"/>
+            </w:tcMar>
+            <w:shd w:fill="F2F4F7"/>
+          </w:tcPr>
+          <w:p>
+            <w:pPr>
+              <w:spacing w:after="0"/>
+            </w:pPr>
+            <w:r>
+              <w:rPr>
+                <w:rFonts w:ascii="Calibri" w:hAnsi="Calibri"/>
+                <w:b/>
+                <w:sz w:val="18"/>
+              </w:rPr>
+              <w:t>Queries</w:t>
+            </w:r>
+          </w:p>
+        </w:tc>
+        <w:tc>
+          <w:tcPr>
+            <w:tcW w:type="dxa" w:w="1560"/>
+            <w:vAlign w:val="center"/>
+            <w:tcMar>
+              <w:top w:w="80" w:type="dxa"/>
+              <w:start w:w="120" w:type="dxa"/>
+              <w:bottom w:w="80" w:type="dxa"/>
+              <w:end w:w="120" w:type="dxa"/>
+            </w:tcMar>
+            <w:shd w:fill="F2F4F7"/>
+          </w:tcPr>
+          <w:p>
+            <w:pPr>
+              <w:spacing w:after="0"/>
+            </w:pPr>
+            <w:r>
+              <w:rPr>
+                <w:rFonts w:ascii="Calibri" w:hAnsi="Calibri"/>
+                <w:b/>
+                <w:sz w:val="18"/>
+              </w:rPr>
+              <w:t>Recall@5</w:t>
+            </w:r>
+          </w:p>
+        </w:tc>
+        <w:tc>
+          <w:tcPr>
+            <w:tcW w:type="dxa" w:w="1560"/>
+            <w:vAlign w:val="center"/>
+            <w:tcMar>
+              <w:top w:w="80" w:type="dxa"/>
+              <w:start w:w="120" w:type="dxa"/>
+              <w:bottom w:w="80" w:type="dxa"/>
+              <w:end w:w="120" w:type="dxa"/>
+            </w:tcMar>
+            <w:shd w:fill="F2F4F7"/>
+          </w:tcPr>
+          <w:p>
+            <w:pPr>
+              <w:spacing w:after="0"/>
+            </w:pPr>
+            <w:r>
+              <w:rPr>
+                <w:rFonts w:ascii="Calibri" w:hAnsi="Calibri"/>
+                <w:b/>
+                <w:sz w:val="18"/>
+              </w:rPr>
+              <w:t>Recall@10</w:t>
+            </w:r>
+          </w:p>
+        </w:tc>
+        <w:tc>
+          <w:tcPr>
+            <w:tcW w:type="dxa" w:w="1560"/>
+            <w:vAlign w:val="center"/>
+            <w:tcMar>
+              <w:top w:w="80" w:type="dxa"/>
+              <w:start w:w="120" w:type="dxa"/>
+              <w:bottom w:w="80" w:type="dxa"/>
+              <w:end w:w="120" w:type="dxa"/>
+            </w:tcMar>
+            <w:shd w:fill="F2F4F7"/>
+          </w:tcPr>
+          <w:p>
+            <w:pPr>
+              <w:spacing w:after="0"/>
+            </w:pPr>
+            <w:r>
+              <w:rPr>
+                <w:rFonts w:ascii="Calibri" w:hAnsi="Calibri"/>
+                <w:b/>
+                <w:sz w:val="18"/>
+              </w:rPr>
+              <w:t>MRR</w:t>
+            </w:r>
+          </w:p>
+        </w:tc>
+        <w:tc>
+          <w:tcPr>
+            <w:tcW w:type="dxa" w:w="1560"/>
+            <w:vAlign w:val="center"/>
+            <w:tcMar>
+              <w:top w:w="80" w:type="dxa"/>
+              <w:start w:w="120" w:type="dxa"/>
+              <w:bottom w:w="80" w:type="dxa"/>
+              <w:end w:w="120" w:type="dxa"/>
+            </w:tcMar>
+            <w:shd w:fill="F2F4F7"/>
+          </w:tcPr>
+          <w:p>
+            <w:pPr>
+              <w:spacing w:after="0"/>
+            </w:pPr>
+            <w:r>
+              <w:rPr>
+                <w:rFonts w:ascii="Calibri" w:hAnsi="Calibri"/>
+                <w:b/>
+                <w:sz w:val="18"/>
+              </w:rPr>
+              <w:t>nDCG@10</w:t>
+            </w:r>
+          </w:p>
+        </w:tc>
+      </w:tr>
+      <w:tr>
+        <w:tc>
+          <w:tcPr>
+            <w:tcW w:type="dxa" w:w="1560"/>
+            <w:vAlign w:val="center"/>
+            <w:tcMar>
+              <w:top w:w="80" w:type="dxa"/>
+              <w:start w:w="120" w:type="dxa"/>
+              <w:bottom w:w="80" w:type="dxa"/>
+              <w:end w:w="120" w:type="dxa"/>
+            </w:tcMar>
+          </w:tcPr>
+          <w:p>
+            <w:pPr>
+              <w:spacing w:after="0"/>
+            </w:pPr>
+            <w:r>
+              <w:rPr>
+                <w:rFonts w:ascii="Calibri" w:hAnsi="Calibri"/>
+                <w:sz w:val="18"/>
+              </w:rPr>
+              <w:t>BM25 first stage</w:t>
+            </w:r>
+          </w:p>
+        </w:tc>
+        <w:tc>
+          <w:tcPr>
+            <w:tcW w:type="dxa" w:w="1560"/>
+            <w:vAlign w:val="center"/>
+            <w:tcMar>
+              <w:top w:w="80" w:type="dxa"/>
+              <w:start w:w="120" w:type="dxa"/>
+              <w:bottom w:w="80" w:type="dxa"/>
+              <w:end w:w="120" w:type="dxa"/>
+            </w:tcMar>
+          </w:tcPr>
+          <w:p>
+            <w:pPr>
+              <w:spacing w:after="0"/>
+            </w:pPr>
+            <w:r>
+              <w:rPr>
+                <w:rFonts w:ascii="Calibri" w:hAnsi="Calibri"/>
+                <w:sz w:val="18"/>
+              </w:rPr>
+              <w:t>1,000</w:t>
+            </w:r>
+          </w:p>
+        </w:tc>
+        <w:tc>
+          <w:tcPr>
+            <w:tcW w:type="dxa" w:w="1560"/>
+            <w:vAlign w:val="center"/>
+            <w:tcMar>
+              <w:top w:w="80" w:type="dxa"/>
+              <w:start w:w="120" w:type="dxa"/>
+              <w:bottom w:w="80" w:type="dxa"/>
+              <w:end w:w="120" w:type="dxa"/>
+            </w:tcMar>
+          </w:tcPr>
+          <w:p>
+            <w:pPr>
+              <w:spacing w:after="0"/>
+            </w:pPr>
+            <w:r>
+              <w:rPr>
+                <w:rFonts w:ascii="Calibri" w:hAnsi="Calibri"/>
+                <w:sz w:val="18"/>
+              </w:rPr>
+              <w:t>0.947</w:t>
+            </w:r>
+          </w:p>
+        </w:tc>
+        <w:tc>
+          <w:tcPr>
+            <w:tcW w:type="dxa" w:w="1560"/>
+            <w:vAlign w:val="center"/>
+            <w:tcMar>
+              <w:top w:w="80" w:type="dxa"/>
+              <w:start w:w="120" w:type="dxa"/>
+              <w:bottom w:w="80" w:type="dxa"/>
+              <w:end w:w="120" w:type="dxa"/>
+            </w:tcMar>
+          </w:tcPr>
+          <w:p>
+            <w:pPr>
+              <w:spacing w:after="0"/>
+            </w:pPr>
+            <w:r>
+              <w:rPr>
+                <w:rFonts w:ascii="Calibri" w:hAnsi="Calibri"/>
+                <w:sz w:val="18"/>
+              </w:rPr>
+              <w:t>0.975</w:t>
+            </w:r>
+          </w:p>
+        </w:tc>
+        <w:tc>
+          <w:tcPr>
+            <w:tcW w:type="dxa" w:w="1560"/>
+            <w:vAlign w:val="center"/>
+            <w:tcMar>
+              <w:top w:w="80" w:type="dxa"/>
+              <w:start w:w="120" w:type="dxa"/>
+              <w:bottom w:w="80" w:type="dxa"/>
+              <w:end w:w="120" w:type="dxa"/>
+            </w:tcMar>
+          </w:tcPr>
+          <w:p>
+            <w:pPr>
+              <w:spacing w:after="0"/>
+            </w:pPr>
+            <w:r>
+              <w:rPr>
+                <w:rFonts w:ascii="Calibri" w:hAnsi="Calibri"/>
+                <w:sz w:val="18"/>
+              </w:rPr>
+              <w:t>0.864</w:t>
+            </w:r>
+          </w:p>
+        </w:tc>
+        <w:tc>
+          <w:tcPr>
+            <w:tcW w:type="dxa" w:w="1560"/>
+            <w:vAlign w:val="center"/>
+            <w:tcMar>
+              <w:top w:w="80" w:type="dxa"/>
+              <w:start w:w="120" w:type="dxa"/>
+              <w:bottom w:w="80" w:type="dxa"/>
+              <w:end w:w="120" w:type="dxa"/>
+            </w:tcMar>
+          </w:tcPr>
+          <w:p>
+            <w:pPr>
+              <w:spacing w:after="0"/>
+            </w:pPr>
+            <w:r>
+              <w:rPr>
+                <w:rFonts w:ascii="Calibri" w:hAnsi="Calibri"/>
+                <w:sz w:val="18"/>
+              </w:rPr>
+              <w:t>0.890</w:t>
+            </w:r>
+          </w:p>
+        </w:tc>
+      </w:tr>
+      <w:tr>
+        <w:tc>
+          <w:tcPr>
+            <w:tcW w:type="dxa" w:w="1560"/>
+            <w:vAlign w:val="center"/>
+            <w:tcMar>
+              <w:top w:w="80" w:type="dxa"/>
+              <w:start w:w="120" w:type="dxa"/>
+              <w:bottom w:w="80" w:type="dxa"/>
+              <w:end w:w="120" w:type="dxa"/>
+            </w:tcMar>
+          </w:tcPr>
+          <w:p>
+            <w:pPr>
+              <w:spacing w:after="0"/>
+            </w:pPr>
+            <w:r>
+              <w:rPr>
+                <w:rFonts w:ascii="Calibri" w:hAnsi="Calibri"/>
+                <w:sz w:val="18"/>
+              </w:rPr>
+              <w:t>Fine-tuned reranker</w:t>
+            </w:r>
+          </w:p>
+        </w:tc>
+        <w:tc>
+          <w:tcPr>
+            <w:tcW w:type="dxa" w:w="1560"/>
+            <w:vAlign w:val="center"/>
+            <w:tcMar>
+              <w:top w:w="80" w:type="dxa"/>
+              <w:start w:w="120" w:type="dxa"/>
+              <w:bottom w:w="80" w:type="dxa"/>
+              <w:end w:w="120" w:type="dxa"/>
+            </w:tcMar>
+          </w:tcPr>
+          <w:p>
+            <w:pPr>
+              <w:spacing w:after="0"/>
+            </w:pPr>
+            <w:r>
+              <w:rPr>
+                <w:rFonts w:ascii="Calibri" w:hAnsi="Calibri"/>
+                <w:sz w:val="18"/>
+              </w:rPr>
+              <w:t>1,000</w:t>
+            </w:r>
+          </w:p>
+        </w:tc>
+        <w:tc>
+          <w:tcPr>
+            <w:tcW w:type="dxa" w:w="1560"/>
+            <w:vAlign w:val="center"/>
+            <w:tcMar>
+              <w:top w:w="80" w:type="dxa"/>
+              <w:start w:w="120" w:type="dxa"/>
+              <w:bottom w:w="80" w:type="dxa"/>
+              <w:end w:w="120" w:type="dxa"/>
+            </w:tcMar>
+          </w:tcPr>
+          <w:p>
+            <w:pPr>
+              <w:spacing w:after="0"/>
+            </w:pPr>
+            <w:r>
+              <w:rPr>
+                <w:rFonts w:ascii="Calibri" w:hAnsi="Calibri"/>
+                <w:sz w:val="18"/>
+              </w:rPr>
+              <w:t>0.882</w:t>
+            </w:r>
+          </w:p>
+        </w:tc>
+        <w:tc>
+          <w:tcPr>
+            <w:tcW w:type="dxa" w:w="1560"/>
+            <w:vAlign w:val="center"/>
+            <w:tcMar>
+              <w:top w:w="80" w:type="dxa"/>
+              <w:start w:w="120" w:type="dxa"/>
+              <w:bottom w:w="80" w:type="dxa"/>
+              <w:end w:w="120" w:type="dxa"/>
+            </w:tcMar>
+          </w:tcPr>
+          <w:p>
+            <w:pPr>
+              <w:spacing w:after="0"/>
+            </w:pPr>
+            <w:r>
+              <w:rPr>
+                <w:rFonts w:ascii="Calibri" w:hAnsi="Calibri"/>
+                <w:sz w:val="18"/>
+              </w:rPr>
+              <w:t>0.915</w:t>
+            </w:r>
+          </w:p>
+        </w:tc>
+        <w:tc>
+          <w:tcPr>
+            <w:tcW w:type="dxa" w:w="1560"/>
+            <w:vAlign w:val="center"/>
+            <w:tcMar>
+              <w:top w:w="80" w:type="dxa"/>
+              <w:start w:w="120" w:type="dxa"/>
+              <w:bottom w:w="80" w:type="dxa"/>
+              <w:end w:w="120" w:type="dxa"/>
+            </w:tcMar>
+          </w:tcPr>
+          <w:p>
+            <w:pPr>
+              <w:spacing w:after="0"/>
+            </w:pPr>
+            <w:r>
+              <w:rPr>
+                <w:rFonts w:ascii="Calibri" w:hAnsi="Calibri"/>
+                <w:sz w:val="18"/>
+              </w:rPr>
+              <w:t>0.789</w:t>
+            </w:r>
+          </w:p>
+        </w:tc>
+        <w:tc>
+          <w:tcPr>
+            <w:tcW w:type="dxa" w:w="1560"/>
+            <w:vAlign w:val="center"/>
+            <w:tcMar>
+              <w:top w:w="80" w:type="dxa"/>
+              <w:start w:w="120" w:type="dxa"/>
+              <w:bottom w:w="80" w:type="dxa"/>
+              <w:end w:w="120" w:type="dxa"/>
+            </w:tcMar>
+          </w:tcPr>
+          <w:p>
+            <w:pPr>
+              <w:spacing w:after="0"/>
+            </w:pPr>
+            <w:r>
+              <w:rPr>
+                <w:rFonts w:ascii="Calibri" w:hAnsi="Calibri"/>
+                <w:sz w:val="18"/>
+              </w:rPr>
+              <w:t>0.820</w:t>
+            </w:r>
+          </w:p>
+        </w:tc>
+      </w:tr>
+    </w:tbl>
+    <w:p/>
+    <w:p>
+      <w:r>
+        <w:t>The fine-tuned reranker substantially improves over the pretrained reranker, but it still does not beat the raw BM25 ranking. Therefore, the final demo uses BM25 directly while reporting reranker fine-tuning as an ablation.</w:t>
       </w:r>
     </w:p>
     <w:p>
@@ -3572,6 +4054,8 @@
         <w:br/>
         <w:t>python scripts/evaluate_llm_judge.py --input outputs/qa_eval_extractive_bm25_full.json --provider nli --output outputs/nli_judge_faithfulness_full.json</w:t>
         <w:br/>
+        <w:t>python scripts/evaluate_reranker.py --reranker-model outputs/models/legal_cross_encoder_reranker_full_cpu_128 --candidate-k 50 --top-k 10 --batch-size 16 --max-length 128 --output outputs/reranker_eval_finetuned_full_cpu_128_full.json</w:t>
+        <w:br/>
         <w:t>python scripts/analyze_qa_errors.py --input outputs/qa_eval_extractive_bm25_full.json --output outputs/qa_error_analysis.md</w:t>
       </w:r>
     </w:p>
@@ -3604,7 +4088,7 @@
     </w:p>
     <w:p>
       <w:r>
-        <w:t>The local environment used for these experiments is CPU-only. CUDA is not available. Because of this, full embedding fine-tuning was run with a smaller CPU configuration, while full cross-encoder fine-tuning and large LLM fine-tuning were prepared as reproducible scripts but not fully executed locally.</w:t>
+        <w:t>The local environment used for these experiments is CPU-only. CUDA is not available. Because of this, full embedding and cross-encoder reranker fine-tuning were run with smaller CPU configurations, while large LLM fine-tuning was prepared as reproducible data and scripts but not fully executed locally.</w:t>
       </w:r>
     </w:p>
     <w:p>
@@ -3625,14 +4109,6 @@
         <w:pStyle w:val="ListBullet"/>
       </w:pPr>
       <w:r>
-        <w:t>Pretrained reranking was evaluated on 100 queries due to CPU inference cost.</w:t>
-      </w:r>
-    </w:p>
-    <w:p>
-      <w:pPr>
-        <w:pStyle w:val="ListBullet"/>
-      </w:pPr>
-      <w:r>
         <w:t>CPU embedding fine-tuning degraded dense retrieval, so the final demo uses BM25.</w:t>
       </w:r>
     </w:p>
@@ -3641,7 +4117,7 @@
         <w:pStyle w:val="ListBullet"/>
       </w:pPr>
       <w:r>
-        <w:t>Full reranker and LLM fine-tuning should be run on GPU.</w:t>
+        <w:t>CPU reranker fine-tuning improved over the pretrained reranker but still did not beat BM25.</w:t>
       </w:r>
     </w:p>
     <w:p>
@@ -3649,7 +4125,7 @@
         <w:pStyle w:val="ListBullet"/>
       </w:pPr>
       <w:r>
-        <w:t>LLM-based faithfulness judging is not yet included; the current faithfulness score is a lexical proxy.</w:t>
+        <w:t>Full LLM fine-tuning should be run on GPU.</w:t>
       </w:r>
     </w:p>
     <w:p>
@@ -3672,7 +4148,7 @@
     </w:p>
     <w:p>
       <w:r>
-        <w:t>The experiments also reveal clear optimization directions. Generic dense embeddings underperform lexical retrieval, a naive CPU triplet fine-tuning run further degrades dense retrieval, and a pretrained general-domain reranker hurts performance. Therefore, future optimized systems should use carefully validated domain adaptation rather than assuming that fine-tuning alone will improve the pipeline.</w:t>
+        <w:t>The experiments also reveal clear optimization directions. Generic dense embeddings underperform lexical retrieval, a naive CPU triplet fine-tuning run further degrades dense retrieval, and a pretrained general-domain reranker hurts performance. Fine-tuning the reranker improves it substantially, but the direct BM25 ranking remains strongest on this benchmark. Therefore, future optimized systems should use carefully validated domain adaptation rather than assuming that fine-tuning alone will improve the pipeline.</w:t>
       </w:r>
     </w:p>
     <w:sectPr>

</xml_diff>

<commit_message>
Add LLM SFT smoke experiment
</commit_message>
<xml_diff>
--- a/deliverables/Turkish_Legal_RAG_Final_Report.docx
+++ b/deliverables/Turkish_Legal_RAG_Final_Report.docx
@@ -3945,6 +3945,676 @@
     </w:p>
     <w:p>
       <w:pPr>
+        <w:pStyle w:val="Heading2"/>
+      </w:pPr>
+      <w:r>
+        <w:t>6.6 LLM/SFT Smoke Experiment</w:t>
+      </w:r>
+    </w:p>
+    <w:p>
+      <w:r>
+        <w:t>The dataset includes 13,758 source-grounded instruction-tuning examples in `llm.jsonl`. A CPU-safe seq2seq fine-tuning script was added in `scripts/train_seq2seq_generator.py` to verify that the LLM training path works end to end.</w:t>
+      </w:r>
+    </w:p>
+    <w:p>
+      <w:r>
+        <w:t>The smoke run used `google/flan-t5-small` with 512 examples, one epoch, batch size 2, gradient accumulation 8, max input length 512, and max target length 160. It trained 448 examples and evaluated on 64 examples.</w:t>
+      </w:r>
+    </w:p>
+    <w:tbl>
+      <w:tblPr>
+        <w:tblStyle w:val="TableGrid"/>
+        <w:tblW w:type="auto" w:w="0"/>
+        <w:jc w:val="center"/>
+        <w:tblLook w:firstColumn="1" w:firstRow="1" w:lastColumn="0" w:lastRow="0" w:noHBand="0" w:noVBand="1" w:val="04A0"/>
+      </w:tblPr>
+      <w:tblGrid>
+        <w:gridCol w:w="1560"/>
+        <w:gridCol w:w="1560"/>
+        <w:gridCol w:w="1560"/>
+        <w:gridCol w:w="1560"/>
+        <w:gridCol w:w="1560"/>
+        <w:gridCol w:w="1560"/>
+      </w:tblGrid>
+      <w:tr>
+        <w:tc>
+          <w:tcPr>
+            <w:tcW w:type="dxa" w:w="1560"/>
+            <w:vAlign w:val="center"/>
+            <w:tcMar>
+              <w:top w:w="80" w:type="dxa"/>
+              <w:start w:w="120" w:type="dxa"/>
+              <w:bottom w:w="80" w:type="dxa"/>
+              <w:end w:w="120" w:type="dxa"/>
+            </w:tcMar>
+            <w:shd w:fill="F2F4F7"/>
+          </w:tcPr>
+          <w:p>
+            <w:pPr>
+              <w:spacing w:after="0"/>
+            </w:pPr>
+            <w:r>
+              <w:rPr>
+                <w:rFonts w:ascii="Calibri" w:hAnsi="Calibri"/>
+                <w:b/>
+                <w:sz w:val="18"/>
+              </w:rPr>
+              <w:t>Model</w:t>
+            </w:r>
+          </w:p>
+        </w:tc>
+        <w:tc>
+          <w:tcPr>
+            <w:tcW w:type="dxa" w:w="1560"/>
+            <w:vAlign w:val="center"/>
+            <w:tcMar>
+              <w:top w:w="80" w:type="dxa"/>
+              <w:start w:w="120" w:type="dxa"/>
+              <w:bottom w:w="80" w:type="dxa"/>
+              <w:end w:w="120" w:type="dxa"/>
+            </w:tcMar>
+            <w:shd w:fill="F2F4F7"/>
+          </w:tcPr>
+          <w:p>
+            <w:pPr>
+              <w:spacing w:after="0"/>
+            </w:pPr>
+            <w:r>
+              <w:rPr>
+                <w:rFonts w:ascii="Calibri" w:hAnsi="Calibri"/>
+                <w:b/>
+                <w:sz w:val="18"/>
+              </w:rPr>
+              <w:t>Train examples</w:t>
+            </w:r>
+          </w:p>
+        </w:tc>
+        <w:tc>
+          <w:tcPr>
+            <w:tcW w:type="dxa" w:w="1560"/>
+            <w:vAlign w:val="center"/>
+            <w:tcMar>
+              <w:top w:w="80" w:type="dxa"/>
+              <w:start w:w="120" w:type="dxa"/>
+              <w:bottom w:w="80" w:type="dxa"/>
+              <w:end w:w="120" w:type="dxa"/>
+            </w:tcMar>
+            <w:shd w:fill="F2F4F7"/>
+          </w:tcPr>
+          <w:p>
+            <w:pPr>
+              <w:spacing w:after="0"/>
+            </w:pPr>
+            <w:r>
+              <w:rPr>
+                <w:rFonts w:ascii="Calibri" w:hAnsi="Calibri"/>
+                <w:b/>
+                <w:sz w:val="18"/>
+              </w:rPr>
+              <w:t>Eval examples</w:t>
+            </w:r>
+          </w:p>
+        </w:tc>
+        <w:tc>
+          <w:tcPr>
+            <w:tcW w:type="dxa" w:w="1560"/>
+            <w:vAlign w:val="center"/>
+            <w:tcMar>
+              <w:top w:w="80" w:type="dxa"/>
+              <w:start w:w="120" w:type="dxa"/>
+              <w:bottom w:w="80" w:type="dxa"/>
+              <w:end w:w="120" w:type="dxa"/>
+            </w:tcMar>
+            <w:shd w:fill="F2F4F7"/>
+          </w:tcPr>
+          <w:p>
+            <w:pPr>
+              <w:spacing w:after="0"/>
+            </w:pPr>
+            <w:r>
+              <w:rPr>
+                <w:rFonts w:ascii="Calibri" w:hAnsi="Calibri"/>
+                <w:b/>
+                <w:sz w:val="18"/>
+              </w:rPr>
+              <w:t>Runtime</w:t>
+            </w:r>
+          </w:p>
+        </w:tc>
+        <w:tc>
+          <w:tcPr>
+            <w:tcW w:type="dxa" w:w="1560"/>
+            <w:vAlign w:val="center"/>
+            <w:tcMar>
+              <w:top w:w="80" w:type="dxa"/>
+              <w:start w:w="120" w:type="dxa"/>
+              <w:bottom w:w="80" w:type="dxa"/>
+              <w:end w:w="120" w:type="dxa"/>
+            </w:tcMar>
+            <w:shd w:fill="F2F4F7"/>
+          </w:tcPr>
+          <w:p>
+            <w:pPr>
+              <w:spacing w:after="0"/>
+            </w:pPr>
+            <w:r>
+              <w:rPr>
+                <w:rFonts w:ascii="Calibri" w:hAnsi="Calibri"/>
+                <w:b/>
+                <w:sz w:val="18"/>
+              </w:rPr>
+              <w:t>Train loss</w:t>
+            </w:r>
+          </w:p>
+        </w:tc>
+        <w:tc>
+          <w:tcPr>
+            <w:tcW w:type="dxa" w:w="1560"/>
+            <w:vAlign w:val="center"/>
+            <w:tcMar>
+              <w:top w:w="80" w:type="dxa"/>
+              <w:start w:w="120" w:type="dxa"/>
+              <w:bottom w:w="80" w:type="dxa"/>
+              <w:end w:w="120" w:type="dxa"/>
+            </w:tcMar>
+            <w:shd w:fill="F2F4F7"/>
+          </w:tcPr>
+          <w:p>
+            <w:pPr>
+              <w:spacing w:after="0"/>
+            </w:pPr>
+            <w:r>
+              <w:rPr>
+                <w:rFonts w:ascii="Calibri" w:hAnsi="Calibri"/>
+                <w:b/>
+                <w:sz w:val="18"/>
+              </w:rPr>
+              <w:t>Eval loss</w:t>
+            </w:r>
+          </w:p>
+        </w:tc>
+      </w:tr>
+      <w:tr>
+        <w:tc>
+          <w:tcPr>
+            <w:tcW w:type="dxa" w:w="1560"/>
+            <w:vAlign w:val="center"/>
+            <w:tcMar>
+              <w:top w:w="80" w:type="dxa"/>
+              <w:start w:w="120" w:type="dxa"/>
+              <w:bottom w:w="80" w:type="dxa"/>
+              <w:end w:w="120" w:type="dxa"/>
+            </w:tcMar>
+          </w:tcPr>
+          <w:p>
+            <w:pPr>
+              <w:spacing w:after="0"/>
+            </w:pPr>
+            <w:r>
+              <w:rPr>
+                <w:rFonts w:ascii="Calibri" w:hAnsi="Calibri"/>
+                <w:sz w:val="18"/>
+              </w:rPr>
+              <w:t>FLAN-T5-small SFT smoke</w:t>
+            </w:r>
+          </w:p>
+        </w:tc>
+        <w:tc>
+          <w:tcPr>
+            <w:tcW w:type="dxa" w:w="1560"/>
+            <w:vAlign w:val="center"/>
+            <w:tcMar>
+              <w:top w:w="80" w:type="dxa"/>
+              <w:start w:w="120" w:type="dxa"/>
+              <w:bottom w:w="80" w:type="dxa"/>
+              <w:end w:w="120" w:type="dxa"/>
+            </w:tcMar>
+          </w:tcPr>
+          <w:p>
+            <w:pPr>
+              <w:spacing w:after="0"/>
+            </w:pPr>
+            <w:r>
+              <w:rPr>
+                <w:rFonts w:ascii="Calibri" w:hAnsi="Calibri"/>
+                <w:sz w:val="18"/>
+              </w:rPr>
+              <w:t>448</w:t>
+            </w:r>
+          </w:p>
+        </w:tc>
+        <w:tc>
+          <w:tcPr>
+            <w:tcW w:type="dxa" w:w="1560"/>
+            <w:vAlign w:val="center"/>
+            <w:tcMar>
+              <w:top w:w="80" w:type="dxa"/>
+              <w:start w:w="120" w:type="dxa"/>
+              <w:bottom w:w="80" w:type="dxa"/>
+              <w:end w:w="120" w:type="dxa"/>
+            </w:tcMar>
+          </w:tcPr>
+          <w:p>
+            <w:pPr>
+              <w:spacing w:after="0"/>
+            </w:pPr>
+            <w:r>
+              <w:rPr>
+                <w:rFonts w:ascii="Calibri" w:hAnsi="Calibri"/>
+                <w:sz w:val="18"/>
+              </w:rPr>
+              <w:t>64</w:t>
+            </w:r>
+          </w:p>
+        </w:tc>
+        <w:tc>
+          <w:tcPr>
+            <w:tcW w:type="dxa" w:w="1560"/>
+            <w:vAlign w:val="center"/>
+            <w:tcMar>
+              <w:top w:w="80" w:type="dxa"/>
+              <w:start w:w="120" w:type="dxa"/>
+              <w:bottom w:w="80" w:type="dxa"/>
+              <w:end w:w="120" w:type="dxa"/>
+            </w:tcMar>
+          </w:tcPr>
+          <w:p>
+            <w:pPr>
+              <w:spacing w:after="0"/>
+            </w:pPr>
+            <w:r>
+              <w:rPr>
+                <w:rFonts w:ascii="Calibri" w:hAnsi="Calibri"/>
+                <w:sz w:val="18"/>
+              </w:rPr>
+              <w:t>629 sec</w:t>
+            </w:r>
+          </w:p>
+        </w:tc>
+        <w:tc>
+          <w:tcPr>
+            <w:tcW w:type="dxa" w:w="1560"/>
+            <w:vAlign w:val="center"/>
+            <w:tcMar>
+              <w:top w:w="80" w:type="dxa"/>
+              <w:start w:w="120" w:type="dxa"/>
+              <w:bottom w:w="80" w:type="dxa"/>
+              <w:end w:w="120" w:type="dxa"/>
+            </w:tcMar>
+          </w:tcPr>
+          <w:p>
+            <w:pPr>
+              <w:spacing w:after="0"/>
+            </w:pPr>
+            <w:r>
+              <w:rPr>
+                <w:rFonts w:ascii="Calibri" w:hAnsi="Calibri"/>
+                <w:sz w:val="18"/>
+              </w:rPr>
+              <w:t>7.368</w:t>
+            </w:r>
+          </w:p>
+        </w:tc>
+        <w:tc>
+          <w:tcPr>
+            <w:tcW w:type="dxa" w:w="1560"/>
+            <w:vAlign w:val="center"/>
+            <w:tcMar>
+              <w:top w:w="80" w:type="dxa"/>
+              <w:start w:w="120" w:type="dxa"/>
+              <w:bottom w:w="80" w:type="dxa"/>
+              <w:end w:w="120" w:type="dxa"/>
+            </w:tcMar>
+          </w:tcPr>
+          <w:p>
+            <w:pPr>
+              <w:spacing w:after="0"/>
+            </w:pPr>
+            <w:r>
+              <w:rPr>
+                <w:rFonts w:ascii="Calibri" w:hAnsi="Calibri"/>
+                <w:sz w:val="18"/>
+              </w:rPr>
+              <w:t>0.514</w:t>
+            </w:r>
+          </w:p>
+        </w:tc>
+      </w:tr>
+    </w:tbl>
+    <w:p/>
+    <w:p>
+      <w:r>
+        <w:t>The fine-tuned smoke generator was then evaluated on 20 gold QA examples with BM25 retrieval:</w:t>
+      </w:r>
+    </w:p>
+    <w:tbl>
+      <w:tblPr>
+        <w:tblStyle w:val="TableGrid"/>
+        <w:tblW w:type="auto" w:w="0"/>
+        <w:jc w:val="center"/>
+        <w:tblLook w:firstColumn="1" w:firstRow="1" w:lastColumn="0" w:lastRow="0" w:noHBand="0" w:noVBand="1" w:val="04A0"/>
+      </w:tblPr>
+      <w:tblGrid>
+        <w:gridCol w:w="1560"/>
+        <w:gridCol w:w="1560"/>
+        <w:gridCol w:w="1560"/>
+        <w:gridCol w:w="1560"/>
+        <w:gridCol w:w="1560"/>
+        <w:gridCol w:w="1560"/>
+      </w:tblGrid>
+      <w:tr>
+        <w:tc>
+          <w:tcPr>
+            <w:tcW w:type="dxa" w:w="1560"/>
+            <w:vAlign w:val="center"/>
+            <w:tcMar>
+              <w:top w:w="80" w:type="dxa"/>
+              <w:start w:w="120" w:type="dxa"/>
+              <w:bottom w:w="80" w:type="dxa"/>
+              <w:end w:w="120" w:type="dxa"/>
+            </w:tcMar>
+            <w:shd w:fill="F2F4F7"/>
+          </w:tcPr>
+          <w:p>
+            <w:pPr>
+              <w:spacing w:after="0"/>
+            </w:pPr>
+            <w:r>
+              <w:rPr>
+                <w:rFonts w:ascii="Calibri" w:hAnsi="Calibri"/>
+                <w:b/>
+                <w:sz w:val="18"/>
+              </w:rPr>
+              <w:t>Generator</w:t>
+            </w:r>
+          </w:p>
+        </w:tc>
+        <w:tc>
+          <w:tcPr>
+            <w:tcW w:type="dxa" w:w="1560"/>
+            <w:vAlign w:val="center"/>
+            <w:tcMar>
+              <w:top w:w="80" w:type="dxa"/>
+              <w:start w:w="120" w:type="dxa"/>
+              <w:bottom w:w="80" w:type="dxa"/>
+              <w:end w:w="120" w:type="dxa"/>
+            </w:tcMar>
+            <w:shd w:fill="F2F4F7"/>
+          </w:tcPr>
+          <w:p>
+            <w:pPr>
+              <w:spacing w:after="0"/>
+            </w:pPr>
+            <w:r>
+              <w:rPr>
+                <w:rFonts w:ascii="Calibri" w:hAnsi="Calibri"/>
+                <w:b/>
+                <w:sz w:val="18"/>
+              </w:rPr>
+              <w:t>EM</w:t>
+            </w:r>
+          </w:p>
+        </w:tc>
+        <w:tc>
+          <w:tcPr>
+            <w:tcW w:type="dxa" w:w="1560"/>
+            <w:vAlign w:val="center"/>
+            <w:tcMar>
+              <w:top w:w="80" w:type="dxa"/>
+              <w:start w:w="120" w:type="dxa"/>
+              <w:bottom w:w="80" w:type="dxa"/>
+              <w:end w:w="120" w:type="dxa"/>
+            </w:tcMar>
+            <w:shd w:fill="F2F4F7"/>
+          </w:tcPr>
+          <w:p>
+            <w:pPr>
+              <w:spacing w:after="0"/>
+            </w:pPr>
+            <w:r>
+              <w:rPr>
+                <w:rFonts w:ascii="Calibri" w:hAnsi="Calibri"/>
+                <w:b/>
+                <w:sz w:val="18"/>
+              </w:rPr>
+              <w:t>Token F1</w:t>
+            </w:r>
+          </w:p>
+        </w:tc>
+        <w:tc>
+          <w:tcPr>
+            <w:tcW w:type="dxa" w:w="1560"/>
+            <w:vAlign w:val="center"/>
+            <w:tcMar>
+              <w:top w:w="80" w:type="dxa"/>
+              <w:start w:w="120" w:type="dxa"/>
+              <w:bottom w:w="80" w:type="dxa"/>
+              <w:end w:w="120" w:type="dxa"/>
+            </w:tcMar>
+            <w:shd w:fill="F2F4F7"/>
+          </w:tcPr>
+          <w:p>
+            <w:pPr>
+              <w:spacing w:after="0"/>
+            </w:pPr>
+            <w:r>
+              <w:rPr>
+                <w:rFonts w:ascii="Calibri" w:hAnsi="Calibri"/>
+                <w:b/>
+                <w:sz w:val="18"/>
+              </w:rPr>
+              <w:t>ROUGE-L</w:t>
+            </w:r>
+          </w:p>
+        </w:tc>
+        <w:tc>
+          <w:tcPr>
+            <w:tcW w:type="dxa" w:w="1560"/>
+            <w:vAlign w:val="center"/>
+            <w:tcMar>
+              <w:top w:w="80" w:type="dxa"/>
+              <w:start w:w="120" w:type="dxa"/>
+              <w:bottom w:w="80" w:type="dxa"/>
+              <w:end w:w="120" w:type="dxa"/>
+            </w:tcMar>
+            <w:shd w:fill="F2F4F7"/>
+          </w:tcPr>
+          <w:p>
+            <w:pPr>
+              <w:spacing w:after="0"/>
+            </w:pPr>
+            <w:r>
+              <w:rPr>
+                <w:rFonts w:ascii="Calibri" w:hAnsi="Calibri"/>
+                <w:b/>
+                <w:sz w:val="18"/>
+              </w:rPr>
+              <w:t>Citation Accuracy</w:t>
+            </w:r>
+          </w:p>
+        </w:tc>
+        <w:tc>
+          <w:tcPr>
+            <w:tcW w:type="dxa" w:w="1560"/>
+            <w:vAlign w:val="center"/>
+            <w:tcMar>
+              <w:top w:w="80" w:type="dxa"/>
+              <w:start w:w="120" w:type="dxa"/>
+              <w:bottom w:w="80" w:type="dxa"/>
+              <w:end w:w="120" w:type="dxa"/>
+            </w:tcMar>
+            <w:shd w:fill="F2F4F7"/>
+          </w:tcPr>
+          <w:p>
+            <w:pPr>
+              <w:spacing w:after="0"/>
+            </w:pPr>
+            <w:r>
+              <w:rPr>
+                <w:rFonts w:ascii="Calibri" w:hAnsi="Calibri"/>
+                <w:b/>
+                <w:sz w:val="18"/>
+              </w:rPr>
+              <w:t>Faithfulness Proxy</w:t>
+            </w:r>
+          </w:p>
+        </w:tc>
+      </w:tr>
+      <w:tr>
+        <w:tc>
+          <w:tcPr>
+            <w:tcW w:type="dxa" w:w="1560"/>
+            <w:vAlign w:val="center"/>
+            <w:tcMar>
+              <w:top w:w="80" w:type="dxa"/>
+              <w:start w:w="120" w:type="dxa"/>
+              <w:bottom w:w="80" w:type="dxa"/>
+              <w:end w:w="120" w:type="dxa"/>
+            </w:tcMar>
+          </w:tcPr>
+          <w:p>
+            <w:pPr>
+              <w:spacing w:after="0"/>
+            </w:pPr>
+            <w:r>
+              <w:rPr>
+                <w:rFonts w:ascii="Calibri" w:hAnsi="Calibri"/>
+                <w:sz w:val="18"/>
+              </w:rPr>
+              <w:t>FLAN-T5-small SFT smoke</w:t>
+            </w:r>
+          </w:p>
+        </w:tc>
+        <w:tc>
+          <w:tcPr>
+            <w:tcW w:type="dxa" w:w="1560"/>
+            <w:vAlign w:val="center"/>
+            <w:tcMar>
+              <w:top w:w="80" w:type="dxa"/>
+              <w:start w:w="120" w:type="dxa"/>
+              <w:bottom w:w="80" w:type="dxa"/>
+              <w:end w:w="120" w:type="dxa"/>
+            </w:tcMar>
+          </w:tcPr>
+          <w:p>
+            <w:pPr>
+              <w:spacing w:after="0"/>
+            </w:pPr>
+            <w:r>
+              <w:rPr>
+                <w:rFonts w:ascii="Calibri" w:hAnsi="Calibri"/>
+                <w:sz w:val="18"/>
+              </w:rPr>
+              <w:t>0.000</w:t>
+            </w:r>
+          </w:p>
+        </w:tc>
+        <w:tc>
+          <w:tcPr>
+            <w:tcW w:type="dxa" w:w="1560"/>
+            <w:vAlign w:val="center"/>
+            <w:tcMar>
+              <w:top w:w="80" w:type="dxa"/>
+              <w:start w:w="120" w:type="dxa"/>
+              <w:bottom w:w="80" w:type="dxa"/>
+              <w:end w:w="120" w:type="dxa"/>
+            </w:tcMar>
+          </w:tcPr>
+          <w:p>
+            <w:pPr>
+              <w:spacing w:after="0"/>
+            </w:pPr>
+            <w:r>
+              <w:rPr>
+                <w:rFonts w:ascii="Calibri" w:hAnsi="Calibri"/>
+                <w:sz w:val="18"/>
+              </w:rPr>
+              <w:t>0.103</w:t>
+            </w:r>
+          </w:p>
+        </w:tc>
+        <w:tc>
+          <w:tcPr>
+            <w:tcW w:type="dxa" w:w="1560"/>
+            <w:vAlign w:val="center"/>
+            <w:tcMar>
+              <w:top w:w="80" w:type="dxa"/>
+              <w:start w:w="120" w:type="dxa"/>
+              <w:bottom w:w="80" w:type="dxa"/>
+              <w:end w:w="120" w:type="dxa"/>
+            </w:tcMar>
+          </w:tcPr>
+          <w:p>
+            <w:pPr>
+              <w:spacing w:after="0"/>
+            </w:pPr>
+            <w:r>
+              <w:rPr>
+                <w:rFonts w:ascii="Calibri" w:hAnsi="Calibri"/>
+                <w:sz w:val="18"/>
+              </w:rPr>
+              <w:t>0.075</w:t>
+            </w:r>
+          </w:p>
+        </w:tc>
+        <w:tc>
+          <w:tcPr>
+            <w:tcW w:type="dxa" w:w="1560"/>
+            <w:vAlign w:val="center"/>
+            <w:tcMar>
+              <w:top w:w="80" w:type="dxa"/>
+              <w:start w:w="120" w:type="dxa"/>
+              <w:bottom w:w="80" w:type="dxa"/>
+              <w:end w:w="120" w:type="dxa"/>
+            </w:tcMar>
+          </w:tcPr>
+          <w:p>
+            <w:pPr>
+              <w:spacing w:after="0"/>
+            </w:pPr>
+            <w:r>
+              <w:rPr>
+                <w:rFonts w:ascii="Calibri" w:hAnsi="Calibri"/>
+                <w:sz w:val="18"/>
+              </w:rPr>
+              <w:t>0.000</w:t>
+            </w:r>
+          </w:p>
+        </w:tc>
+        <w:tc>
+          <w:tcPr>
+            <w:tcW w:type="dxa" w:w="1560"/>
+            <w:vAlign w:val="center"/>
+            <w:tcMar>
+              <w:top w:w="80" w:type="dxa"/>
+              <w:start w:w="120" w:type="dxa"/>
+              <w:bottom w:w="80" w:type="dxa"/>
+              <w:end w:w="120" w:type="dxa"/>
+            </w:tcMar>
+          </w:tcPr>
+          <w:p>
+            <w:pPr>
+              <w:spacing w:after="0"/>
+            </w:pPr>
+            <w:r>
+              <w:rPr>
+                <w:rFonts w:ascii="Calibri" w:hAnsi="Calibri"/>
+                <w:sz w:val="18"/>
+              </w:rPr>
+              <w:t>0.616</w:t>
+            </w:r>
+          </w:p>
+        </w:tc>
+      </w:tr>
+    </w:tbl>
+    <w:p/>
+    <w:p>
+      <w:r>
+        <w:t>This confirms that the LLM/SFT pipeline works, but the small CPU-trained model is not strong enough for the final demo. The final system therefore keeps the extractive grounded generator for reliability and citation correctness.</w:t>
+      </w:r>
+    </w:p>
+    <w:p>
+      <w:pPr>
         <w:pStyle w:val="Heading1"/>
       </w:pPr>
       <w:r>
@@ -4056,6 +4726,8 @@
         <w:br/>
         <w:t>python scripts/evaluate_reranker.py --reranker-model outputs/models/legal_cross_encoder_reranker_full_cpu_128 --candidate-k 50 --top-k 10 --batch-size 16 --max-length 128 --output outputs/reranker_eval_finetuned_full_cpu_128_full.json</w:t>
         <w:br/>
+        <w:t>python scripts/train_seq2seq_generator.py --limit 512 --eval-size 64 --epochs 1 --batch-size 2 --grad-accum 8 --max-input-length 512 --max-target-length 160 --output-dir outputs/models/flan_t5_legal_sft_smoke_512 --metrics-output outputs/llm_sft_smoke_512_metrics.json</w:t>
+        <w:br/>
         <w:t>python scripts/analyze_qa_errors.py --input outputs/qa_eval_extractive_bm25_full.json --output outputs/qa_error_analysis.md</w:t>
       </w:r>
     </w:p>
@@ -4125,7 +4797,15 @@
         <w:pStyle w:val="ListBullet"/>
       </w:pPr>
       <w:r>
-        <w:t>Full LLM fine-tuning should be run on GPU.</w:t>
+        <w:t>CPU FLAN-T5 SFT smoke training worked, but the generated answers were too weak for the final demo.</w:t>
+      </w:r>
+    </w:p>
+    <w:p>
+      <w:pPr>
+        <w:pStyle w:val="ListBullet"/>
+      </w:pPr>
+      <w:r>
+        <w:t>Full LLM fine-tuning should be run on GPU with a stronger Turkish-capable instruction model.</w:t>
       </w:r>
     </w:p>
     <w:p>
@@ -4148,7 +4828,7 @@
     </w:p>
     <w:p>
       <w:r>
-        <w:t>The experiments also reveal clear optimization directions. Generic dense embeddings underperform lexical retrieval, a naive CPU triplet fine-tuning run further degrades dense retrieval, and a pretrained general-domain reranker hurts performance. Fine-tuning the reranker improves it substantially, but the direct BM25 ranking remains strongest on this benchmark. Therefore, future optimized systems should use carefully validated domain adaptation rather than assuming that fine-tuning alone will improve the pipeline.</w:t>
+        <w:t>The experiments also reveal clear optimization directions. Generic dense embeddings underperform lexical retrieval, a naive CPU triplet fine-tuning run further degrades dense retrieval, and a pretrained general-domain reranker hurts performance. Fine-tuning the reranker improves it substantially, but the direct BM25 ranking remains strongest on this benchmark. A small CPU LLM SFT smoke run verifies the generator training path but is not reliable enough for live use. Therefore, future optimized systems should use carefully validated domain adaptation rather than assuming that fine-tuning alone will improve the pipeline.</w:t>
       </w:r>
     </w:p>
     <w:sectPr>

</xml_diff>

<commit_message>
Add controlled ablation evidence
</commit_message>
<xml_diff>
--- a/deliverables/Turkish_Legal_RAG_Final_Report.docx
+++ b/deliverables/Turkish_Legal_RAG_Final_Report.docx
@@ -4481,6 +4481,152 @@
                 <w:rFonts w:ascii="Calibri" w:hAnsi="Calibri"/>
                 <w:sz w:val="18"/>
               </w:rPr>
+              <w:t>Base FLAN-T5-small</w:t>
+            </w:r>
+          </w:p>
+        </w:tc>
+        <w:tc>
+          <w:tcPr>
+            <w:tcW w:type="dxa" w:w="1560"/>
+            <w:vAlign w:val="center"/>
+            <w:tcMar>
+              <w:top w:w="80" w:type="dxa"/>
+              <w:start w:w="120" w:type="dxa"/>
+              <w:bottom w:w="80" w:type="dxa"/>
+              <w:end w:w="120" w:type="dxa"/>
+            </w:tcMar>
+          </w:tcPr>
+          <w:p>
+            <w:pPr>
+              <w:spacing w:after="0"/>
+            </w:pPr>
+            <w:r>
+              <w:rPr>
+                <w:rFonts w:ascii="Calibri" w:hAnsi="Calibri"/>
+                <w:sz w:val="18"/>
+              </w:rPr>
+              <w:t>0.000</w:t>
+            </w:r>
+          </w:p>
+        </w:tc>
+        <w:tc>
+          <w:tcPr>
+            <w:tcW w:type="dxa" w:w="1560"/>
+            <w:vAlign w:val="center"/>
+            <w:tcMar>
+              <w:top w:w="80" w:type="dxa"/>
+              <w:start w:w="120" w:type="dxa"/>
+              <w:bottom w:w="80" w:type="dxa"/>
+              <w:end w:w="120" w:type="dxa"/>
+            </w:tcMar>
+          </w:tcPr>
+          <w:p>
+            <w:pPr>
+              <w:spacing w:after="0"/>
+            </w:pPr>
+            <w:r>
+              <w:rPr>
+                <w:rFonts w:ascii="Calibri" w:hAnsi="Calibri"/>
+                <w:sz w:val="18"/>
+              </w:rPr>
+              <w:t>0.076</w:t>
+            </w:r>
+          </w:p>
+        </w:tc>
+        <w:tc>
+          <w:tcPr>
+            <w:tcW w:type="dxa" w:w="1560"/>
+            <w:vAlign w:val="center"/>
+            <w:tcMar>
+              <w:top w:w="80" w:type="dxa"/>
+              <w:start w:w="120" w:type="dxa"/>
+              <w:bottom w:w="80" w:type="dxa"/>
+              <w:end w:w="120" w:type="dxa"/>
+            </w:tcMar>
+          </w:tcPr>
+          <w:p>
+            <w:pPr>
+              <w:spacing w:after="0"/>
+            </w:pPr>
+            <w:r>
+              <w:rPr>
+                <w:rFonts w:ascii="Calibri" w:hAnsi="Calibri"/>
+                <w:sz w:val="18"/>
+              </w:rPr>
+              <w:t>0.056</w:t>
+            </w:r>
+          </w:p>
+        </w:tc>
+        <w:tc>
+          <w:tcPr>
+            <w:tcW w:type="dxa" w:w="1560"/>
+            <w:vAlign w:val="center"/>
+            <w:tcMar>
+              <w:top w:w="80" w:type="dxa"/>
+              <w:start w:w="120" w:type="dxa"/>
+              <w:bottom w:w="80" w:type="dxa"/>
+              <w:end w:w="120" w:type="dxa"/>
+            </w:tcMar>
+          </w:tcPr>
+          <w:p>
+            <w:pPr>
+              <w:spacing w:after="0"/>
+            </w:pPr>
+            <w:r>
+              <w:rPr>
+                <w:rFonts w:ascii="Calibri" w:hAnsi="Calibri"/>
+                <w:sz w:val="18"/>
+              </w:rPr>
+              <w:t>0.000</w:t>
+            </w:r>
+          </w:p>
+        </w:tc>
+        <w:tc>
+          <w:tcPr>
+            <w:tcW w:type="dxa" w:w="1560"/>
+            <w:vAlign w:val="center"/>
+            <w:tcMar>
+              <w:top w:w="80" w:type="dxa"/>
+              <w:start w:w="120" w:type="dxa"/>
+              <w:bottom w:w="80" w:type="dxa"/>
+              <w:end w:w="120" w:type="dxa"/>
+            </w:tcMar>
+          </w:tcPr>
+          <w:p>
+            <w:pPr>
+              <w:spacing w:after="0"/>
+            </w:pPr>
+            <w:r>
+              <w:rPr>
+                <w:rFonts w:ascii="Calibri" w:hAnsi="Calibri"/>
+                <w:sz w:val="18"/>
+              </w:rPr>
+              <w:t>0.452</w:t>
+            </w:r>
+          </w:p>
+        </w:tc>
+      </w:tr>
+      <w:tr>
+        <w:tc>
+          <w:tcPr>
+            <w:tcW w:type="dxa" w:w="1560"/>
+            <w:vAlign w:val="center"/>
+            <w:tcMar>
+              <w:top w:w="80" w:type="dxa"/>
+              <w:start w:w="120" w:type="dxa"/>
+              <w:bottom w:w="80" w:type="dxa"/>
+              <w:end w:w="120" w:type="dxa"/>
+            </w:tcMar>
+          </w:tcPr>
+          <w:p>
+            <w:pPr>
+              <w:spacing w:after="0"/>
+            </w:pPr>
+            <w:r>
+              <w:rPr>
+                <w:rFonts w:ascii="Calibri" w:hAnsi="Calibri"/>
+                <w:sz w:val="18"/>
+              </w:rPr>
               <w:t>FLAN-T5-small SFT smoke</w:t>
             </w:r>
           </w:p>
@@ -4610,7 +4756,7 @@
     <w:p/>
     <w:p>
       <w:r>
-        <w:t>This confirms that the LLM/SFT pipeline works, but the small CPU-trained model is not strong enough for the final demo. The final system therefore keeps the extractive grounded generator for reliability and citation correctness.</w:t>
+        <w:t>This confirms that the LLM/SFT pipeline works and that fine-tuning improves the same base model under the same generation pipeline. However, the small CPU-trained model is still not strong enough for the final demo. The final system therefore keeps the extractive grounded generator for reliability and citation correctness.</w:t>
       </w:r>
     </w:p>
     <w:p>

</xml_diff>

<commit_message>
Update report with submission evaluation checks
</commit_message>
<xml_diff>
--- a/deliverables/Turkish_Legal_RAG_Final_Report.docx
+++ b/deliverables/Turkish_Legal_RAG_Final_Report.docx
@@ -4843,7 +4843,1004 @@
         <w:pStyle w:val="Heading1"/>
       </w:pPr>
       <w:r>
-        <w:t>8. Reproducibility</w:t>
+        <w:t>8. Submission Compatibility Checks</w:t>
+      </w:r>
+    </w:p>
+    <w:p>
+      <w:r>
+        <w:t>The final repository includes explicit support for instructor-provided custom document collections and benchmark files. A custom corpus can be supplied as `corpus.jsonl`, `corpus_index.jsonl`, or `real_corpus.jsonl`, and each document must include at least an `id` and `text`. A custom benchmark can be supplied as `eval_qa.jsonl`, `custom_benchmark.jsonl`, or `benchmark.jsonl`, with question, gold answer, and relevant document fields.</w:t>
+      </w:r>
+    </w:p>
+    <w:p>
+      <w:r>
+        <w:t>The custom data path was validated with:</w:t>
+      </w:r>
+    </w:p>
+    <w:p>
+      <w:pPr>
+        <w:pStyle w:val="NoSpacing"/>
+      </w:pPr>
+      <w:r>
+        <w:rPr>
+          <w:rFonts w:ascii="Consolas" w:hAnsi="Consolas"/>
+          <w:sz w:val="18"/>
+        </w:rPr>
+        <w:t>python scripts/validate_custom_data.py --data-dir sample_custom_data --require-benchmark</w:t>
+      </w:r>
+    </w:p>
+    <w:p>
+      <w:r>
+        <w:t>Base RAG and fine-tuned RAG can be evaluated on the same corpus, same benchmark, and same answer generator with:</w:t>
+      </w:r>
+    </w:p>
+    <w:p>
+      <w:pPr>
+        <w:pStyle w:val="NoSpacing"/>
+      </w:pPr>
+      <w:r>
+        <w:rPr>
+          <w:rFonts w:ascii="Consolas" w:hAnsi="Consolas"/>
+          <w:sz w:val="18"/>
+        </w:rPr>
+        <w:t>python scripts/run_base_vs_finetuned_eval.py --data-dir sample_custom_data --output-dir outputs/sample_submission_eval</w:t>
+      </w:r>
+    </w:p>
+    <w:p>
+      <w:r>
+        <w:t>On the 150-question local benchmark, a same-generator comparison was run between BM25 base RAG and BM25 plus the fine-tuned cross-encoder reranker:</w:t>
+      </w:r>
+    </w:p>
+    <w:tbl>
+      <w:tblPr>
+        <w:tblStyle w:val="TableGrid"/>
+        <w:tblW w:type="auto" w:w="0"/>
+        <w:jc w:val="center"/>
+        <w:tblLook w:firstColumn="1" w:firstRow="1" w:lastColumn="0" w:lastRow="0" w:noHBand="0" w:noVBand="1" w:val="04A0"/>
+      </w:tblPr>
+      <w:tblGrid>
+        <w:gridCol w:w="3120"/>
+        <w:gridCol w:w="3120"/>
+        <w:gridCol w:w="3120"/>
+      </w:tblGrid>
+      <w:tr>
+        <w:tc>
+          <w:tcPr>
+            <w:tcW w:type="dxa" w:w="3120"/>
+            <w:vAlign w:val="center"/>
+            <w:tcMar>
+              <w:top w:w="80" w:type="dxa"/>
+              <w:start w:w="120" w:type="dxa"/>
+              <w:bottom w:w="80" w:type="dxa"/>
+              <w:end w:w="120" w:type="dxa"/>
+            </w:tcMar>
+            <w:shd w:fill="F2F4F7"/>
+          </w:tcPr>
+          <w:p>
+            <w:pPr>
+              <w:spacing w:after="0"/>
+            </w:pPr>
+            <w:r>
+              <w:rPr>
+                <w:rFonts w:ascii="Calibri" w:hAnsi="Calibri"/>
+                <w:b/>
+                <w:sz w:val="18"/>
+              </w:rPr>
+              <w:t>Metric</w:t>
+            </w:r>
+          </w:p>
+        </w:tc>
+        <w:tc>
+          <w:tcPr>
+            <w:tcW w:type="dxa" w:w="3120"/>
+            <w:vAlign w:val="center"/>
+            <w:tcMar>
+              <w:top w:w="80" w:type="dxa"/>
+              <w:start w:w="120" w:type="dxa"/>
+              <w:bottom w:w="80" w:type="dxa"/>
+              <w:end w:w="120" w:type="dxa"/>
+            </w:tcMar>
+            <w:shd w:fill="F2F4F7"/>
+          </w:tcPr>
+          <w:p>
+            <w:pPr>
+              <w:spacing w:after="0"/>
+            </w:pPr>
+            <w:r>
+              <w:rPr>
+                <w:rFonts w:ascii="Calibri" w:hAnsi="Calibri"/>
+                <w:b/>
+                <w:sz w:val="18"/>
+              </w:rPr>
+              <w:t>Base BM25 RAG</w:t>
+            </w:r>
+          </w:p>
+        </w:tc>
+        <w:tc>
+          <w:tcPr>
+            <w:tcW w:type="dxa" w:w="3120"/>
+            <w:vAlign w:val="center"/>
+            <w:tcMar>
+              <w:top w:w="80" w:type="dxa"/>
+              <w:start w:w="120" w:type="dxa"/>
+              <w:bottom w:w="80" w:type="dxa"/>
+              <w:end w:w="120" w:type="dxa"/>
+            </w:tcMar>
+            <w:shd w:fill="F2F4F7"/>
+          </w:tcPr>
+          <w:p>
+            <w:pPr>
+              <w:spacing w:after="0"/>
+            </w:pPr>
+            <w:r>
+              <w:rPr>
+                <w:rFonts w:ascii="Calibri" w:hAnsi="Calibri"/>
+                <w:b/>
+                <w:sz w:val="18"/>
+              </w:rPr>
+              <w:t>Fine-tuned reranker RAG</w:t>
+            </w:r>
+          </w:p>
+        </w:tc>
+      </w:tr>
+      <w:tr>
+        <w:tc>
+          <w:tcPr>
+            <w:tcW w:type="dxa" w:w="3120"/>
+            <w:vAlign w:val="center"/>
+            <w:tcMar>
+              <w:top w:w="80" w:type="dxa"/>
+              <w:start w:w="120" w:type="dxa"/>
+              <w:bottom w:w="80" w:type="dxa"/>
+              <w:end w:w="120" w:type="dxa"/>
+            </w:tcMar>
+          </w:tcPr>
+          <w:p>
+            <w:pPr>
+              <w:spacing w:after="0"/>
+            </w:pPr>
+            <w:r>
+              <w:rPr>
+                <w:rFonts w:ascii="Calibri" w:hAnsi="Calibri"/>
+                <w:sz w:val="18"/>
+              </w:rPr>
+              <w:t>Token F1</w:t>
+            </w:r>
+          </w:p>
+        </w:tc>
+        <w:tc>
+          <w:tcPr>
+            <w:tcW w:type="dxa" w:w="3120"/>
+            <w:vAlign w:val="center"/>
+            <w:tcMar>
+              <w:top w:w="80" w:type="dxa"/>
+              <w:start w:w="120" w:type="dxa"/>
+              <w:bottom w:w="80" w:type="dxa"/>
+              <w:end w:w="120" w:type="dxa"/>
+            </w:tcMar>
+          </w:tcPr>
+          <w:p>
+            <w:pPr>
+              <w:spacing w:after="0"/>
+            </w:pPr>
+            <w:r>
+              <w:rPr>
+                <w:rFonts w:ascii="Calibri" w:hAnsi="Calibri"/>
+                <w:sz w:val="18"/>
+              </w:rPr>
+              <w:t>0.703</w:t>
+            </w:r>
+          </w:p>
+        </w:tc>
+        <w:tc>
+          <w:tcPr>
+            <w:tcW w:type="dxa" w:w="3120"/>
+            <w:vAlign w:val="center"/>
+            <w:tcMar>
+              <w:top w:w="80" w:type="dxa"/>
+              <w:start w:w="120" w:type="dxa"/>
+              <w:bottom w:w="80" w:type="dxa"/>
+              <w:end w:w="120" w:type="dxa"/>
+            </w:tcMar>
+          </w:tcPr>
+          <w:p>
+            <w:pPr>
+              <w:spacing w:after="0"/>
+            </w:pPr>
+            <w:r>
+              <w:rPr>
+                <w:rFonts w:ascii="Calibri" w:hAnsi="Calibri"/>
+                <w:sz w:val="18"/>
+              </w:rPr>
+              <w:t>0.631</w:t>
+            </w:r>
+          </w:p>
+        </w:tc>
+      </w:tr>
+      <w:tr>
+        <w:tc>
+          <w:tcPr>
+            <w:tcW w:type="dxa" w:w="3120"/>
+            <w:vAlign w:val="center"/>
+            <w:tcMar>
+              <w:top w:w="80" w:type="dxa"/>
+              <w:start w:w="120" w:type="dxa"/>
+              <w:bottom w:w="80" w:type="dxa"/>
+              <w:end w:w="120" w:type="dxa"/>
+            </w:tcMar>
+          </w:tcPr>
+          <w:p>
+            <w:pPr>
+              <w:spacing w:after="0"/>
+            </w:pPr>
+            <w:r>
+              <w:rPr>
+                <w:rFonts w:ascii="Calibri" w:hAnsi="Calibri"/>
+                <w:sz w:val="18"/>
+              </w:rPr>
+              <w:t>ROUGE-L</w:t>
+            </w:r>
+          </w:p>
+        </w:tc>
+        <w:tc>
+          <w:tcPr>
+            <w:tcW w:type="dxa" w:w="3120"/>
+            <w:vAlign w:val="center"/>
+            <w:tcMar>
+              <w:top w:w="80" w:type="dxa"/>
+              <w:start w:w="120" w:type="dxa"/>
+              <w:bottom w:w="80" w:type="dxa"/>
+              <w:end w:w="120" w:type="dxa"/>
+            </w:tcMar>
+          </w:tcPr>
+          <w:p>
+            <w:pPr>
+              <w:spacing w:after="0"/>
+            </w:pPr>
+            <w:r>
+              <w:rPr>
+                <w:rFonts w:ascii="Calibri" w:hAnsi="Calibri"/>
+                <w:sz w:val="18"/>
+              </w:rPr>
+              <w:t>0.702</w:t>
+            </w:r>
+          </w:p>
+        </w:tc>
+        <w:tc>
+          <w:tcPr>
+            <w:tcW w:type="dxa" w:w="3120"/>
+            <w:vAlign w:val="center"/>
+            <w:tcMar>
+              <w:top w:w="80" w:type="dxa"/>
+              <w:start w:w="120" w:type="dxa"/>
+              <w:bottom w:w="80" w:type="dxa"/>
+              <w:end w:w="120" w:type="dxa"/>
+            </w:tcMar>
+          </w:tcPr>
+          <w:p>
+            <w:pPr>
+              <w:spacing w:after="0"/>
+            </w:pPr>
+            <w:r>
+              <w:rPr>
+                <w:rFonts w:ascii="Calibri" w:hAnsi="Calibri"/>
+                <w:sz w:val="18"/>
+              </w:rPr>
+              <w:t>0.621</w:t>
+            </w:r>
+          </w:p>
+        </w:tc>
+      </w:tr>
+      <w:tr>
+        <w:tc>
+          <w:tcPr>
+            <w:tcW w:type="dxa" w:w="3120"/>
+            <w:vAlign w:val="center"/>
+            <w:tcMar>
+              <w:top w:w="80" w:type="dxa"/>
+              <w:start w:w="120" w:type="dxa"/>
+              <w:bottom w:w="80" w:type="dxa"/>
+              <w:end w:w="120" w:type="dxa"/>
+            </w:tcMar>
+          </w:tcPr>
+          <w:p>
+            <w:pPr>
+              <w:spacing w:after="0"/>
+            </w:pPr>
+            <w:r>
+              <w:rPr>
+                <w:rFonts w:ascii="Calibri" w:hAnsi="Calibri"/>
+                <w:sz w:val="18"/>
+              </w:rPr>
+              <w:t>Top-1 source hit</w:t>
+            </w:r>
+          </w:p>
+        </w:tc>
+        <w:tc>
+          <w:tcPr>
+            <w:tcW w:type="dxa" w:w="3120"/>
+            <w:vAlign w:val="center"/>
+            <w:tcMar>
+              <w:top w:w="80" w:type="dxa"/>
+              <w:start w:w="120" w:type="dxa"/>
+              <w:bottom w:w="80" w:type="dxa"/>
+              <w:end w:w="120" w:type="dxa"/>
+            </w:tcMar>
+          </w:tcPr>
+          <w:p>
+            <w:pPr>
+              <w:spacing w:after="0"/>
+            </w:pPr>
+            <w:r>
+              <w:rPr>
+                <w:rFonts w:ascii="Calibri" w:hAnsi="Calibri"/>
+                <w:sz w:val="18"/>
+              </w:rPr>
+              <w:t>0.960</w:t>
+            </w:r>
+          </w:p>
+        </w:tc>
+        <w:tc>
+          <w:tcPr>
+            <w:tcW w:type="dxa" w:w="3120"/>
+            <w:vAlign w:val="center"/>
+            <w:tcMar>
+              <w:top w:w="80" w:type="dxa"/>
+              <w:start w:w="120" w:type="dxa"/>
+              <w:bottom w:w="80" w:type="dxa"/>
+              <w:end w:w="120" w:type="dxa"/>
+            </w:tcMar>
+          </w:tcPr>
+          <w:p>
+            <w:pPr>
+              <w:spacing w:after="0"/>
+            </w:pPr>
+            <w:r>
+              <w:rPr>
+                <w:rFonts w:ascii="Calibri" w:hAnsi="Calibri"/>
+                <w:sz w:val="18"/>
+              </w:rPr>
+              <w:t>0.620</w:t>
+            </w:r>
+          </w:p>
+        </w:tc>
+      </w:tr>
+      <w:tr>
+        <w:tc>
+          <w:tcPr>
+            <w:tcW w:type="dxa" w:w="3120"/>
+            <w:vAlign w:val="center"/>
+            <w:tcMar>
+              <w:top w:w="80" w:type="dxa"/>
+              <w:start w:w="120" w:type="dxa"/>
+              <w:bottom w:w="80" w:type="dxa"/>
+              <w:end w:w="120" w:type="dxa"/>
+            </w:tcMar>
+          </w:tcPr>
+          <w:p>
+            <w:pPr>
+              <w:spacing w:after="0"/>
+            </w:pPr>
+            <w:r>
+              <w:rPr>
+                <w:rFonts w:ascii="Calibri" w:hAnsi="Calibri"/>
+                <w:sz w:val="18"/>
+              </w:rPr>
+              <w:t>Top-5 source hit</w:t>
+            </w:r>
+          </w:p>
+        </w:tc>
+        <w:tc>
+          <w:tcPr>
+            <w:tcW w:type="dxa" w:w="3120"/>
+            <w:vAlign w:val="center"/>
+            <w:tcMar>
+              <w:top w:w="80" w:type="dxa"/>
+              <w:start w:w="120" w:type="dxa"/>
+              <w:bottom w:w="80" w:type="dxa"/>
+              <w:end w:w="120" w:type="dxa"/>
+            </w:tcMar>
+          </w:tcPr>
+          <w:p>
+            <w:pPr>
+              <w:spacing w:after="0"/>
+            </w:pPr>
+            <w:r>
+              <w:rPr>
+                <w:rFonts w:ascii="Calibri" w:hAnsi="Calibri"/>
+                <w:sz w:val="18"/>
+              </w:rPr>
+              <w:t>0.993</w:t>
+            </w:r>
+          </w:p>
+        </w:tc>
+        <w:tc>
+          <w:tcPr>
+            <w:tcW w:type="dxa" w:w="3120"/>
+            <w:vAlign w:val="center"/>
+            <w:tcMar>
+              <w:top w:w="80" w:type="dxa"/>
+              <w:start w:w="120" w:type="dxa"/>
+              <w:bottom w:w="80" w:type="dxa"/>
+              <w:end w:w="120" w:type="dxa"/>
+            </w:tcMar>
+          </w:tcPr>
+          <w:p>
+            <w:pPr>
+              <w:spacing w:after="0"/>
+            </w:pPr>
+            <w:r>
+              <w:rPr>
+                <w:rFonts w:ascii="Calibri" w:hAnsi="Calibri"/>
+                <w:sz w:val="18"/>
+              </w:rPr>
+              <w:t>0.900</w:t>
+            </w:r>
+          </w:p>
+        </w:tc>
+      </w:tr>
+      <w:tr>
+        <w:tc>
+          <w:tcPr>
+            <w:tcW w:type="dxa" w:w="3120"/>
+            <w:vAlign w:val="center"/>
+            <w:tcMar>
+              <w:top w:w="80" w:type="dxa"/>
+              <w:start w:w="120" w:type="dxa"/>
+              <w:bottom w:w="80" w:type="dxa"/>
+              <w:end w:w="120" w:type="dxa"/>
+            </w:tcMar>
+          </w:tcPr>
+          <w:p>
+            <w:pPr>
+              <w:spacing w:after="0"/>
+            </w:pPr>
+            <w:r>
+              <w:rPr>
+                <w:rFonts w:ascii="Calibri" w:hAnsi="Calibri"/>
+                <w:sz w:val="18"/>
+              </w:rPr>
+              <w:t>Citation accuracy</w:t>
+            </w:r>
+          </w:p>
+        </w:tc>
+        <w:tc>
+          <w:tcPr>
+            <w:tcW w:type="dxa" w:w="3120"/>
+            <w:vAlign w:val="center"/>
+            <w:tcMar>
+              <w:top w:w="80" w:type="dxa"/>
+              <w:start w:w="120" w:type="dxa"/>
+              <w:bottom w:w="80" w:type="dxa"/>
+              <w:end w:w="120" w:type="dxa"/>
+            </w:tcMar>
+          </w:tcPr>
+          <w:p>
+            <w:pPr>
+              <w:spacing w:after="0"/>
+            </w:pPr>
+            <w:r>
+              <w:rPr>
+                <w:rFonts w:ascii="Calibri" w:hAnsi="Calibri"/>
+                <w:sz w:val="18"/>
+              </w:rPr>
+              <w:t>0.960</w:t>
+            </w:r>
+          </w:p>
+        </w:tc>
+        <w:tc>
+          <w:tcPr>
+            <w:tcW w:type="dxa" w:w="3120"/>
+            <w:vAlign w:val="center"/>
+            <w:tcMar>
+              <w:top w:w="80" w:type="dxa"/>
+              <w:start w:w="120" w:type="dxa"/>
+              <w:bottom w:w="80" w:type="dxa"/>
+              <w:end w:w="120" w:type="dxa"/>
+            </w:tcMar>
+          </w:tcPr>
+          <w:p>
+            <w:pPr>
+              <w:spacing w:after="0"/>
+            </w:pPr>
+            <w:r>
+              <w:rPr>
+                <w:rFonts w:ascii="Calibri" w:hAnsi="Calibri"/>
+                <w:sz w:val="18"/>
+              </w:rPr>
+              <w:t>0.620</w:t>
+            </w:r>
+          </w:p>
+        </w:tc>
+      </w:tr>
+      <w:tr>
+        <w:tc>
+          <w:tcPr>
+            <w:tcW w:type="dxa" w:w="3120"/>
+            <w:vAlign w:val="center"/>
+            <w:tcMar>
+              <w:top w:w="80" w:type="dxa"/>
+              <w:start w:w="120" w:type="dxa"/>
+              <w:bottom w:w="80" w:type="dxa"/>
+              <w:end w:w="120" w:type="dxa"/>
+            </w:tcMar>
+          </w:tcPr>
+          <w:p>
+            <w:pPr>
+              <w:spacing w:after="0"/>
+            </w:pPr>
+            <w:r>
+              <w:rPr>
+                <w:rFonts w:ascii="Calibri" w:hAnsi="Calibri"/>
+                <w:sz w:val="18"/>
+              </w:rPr>
+              <w:t>NLI faithfulness</w:t>
+            </w:r>
+          </w:p>
+        </w:tc>
+        <w:tc>
+          <w:tcPr>
+            <w:tcW w:type="dxa" w:w="3120"/>
+            <w:vAlign w:val="center"/>
+            <w:tcMar>
+              <w:top w:w="80" w:type="dxa"/>
+              <w:start w:w="120" w:type="dxa"/>
+              <w:bottom w:w="80" w:type="dxa"/>
+              <w:end w:w="120" w:type="dxa"/>
+            </w:tcMar>
+          </w:tcPr>
+          <w:p>
+            <w:pPr>
+              <w:spacing w:after="0"/>
+            </w:pPr>
+            <w:r>
+              <w:rPr>
+                <w:rFonts w:ascii="Calibri" w:hAnsi="Calibri"/>
+                <w:sz w:val="18"/>
+              </w:rPr>
+              <w:t>0.807</w:t>
+            </w:r>
+          </w:p>
+        </w:tc>
+        <w:tc>
+          <w:tcPr>
+            <w:tcW w:type="dxa" w:w="3120"/>
+            <w:vAlign w:val="center"/>
+            <w:tcMar>
+              <w:top w:w="80" w:type="dxa"/>
+              <w:start w:w="120" w:type="dxa"/>
+              <w:bottom w:w="80" w:type="dxa"/>
+              <w:end w:w="120" w:type="dxa"/>
+            </w:tcMar>
+          </w:tcPr>
+          <w:p>
+            <w:pPr>
+              <w:spacing w:after="0"/>
+            </w:pPr>
+            <w:r>
+              <w:rPr>
+                <w:rFonts w:ascii="Calibri" w:hAnsi="Calibri"/>
+                <w:sz w:val="18"/>
+              </w:rPr>
+              <w:t>0.792</w:t>
+            </w:r>
+          </w:p>
+        </w:tc>
+      </w:tr>
+    </w:tbl>
+    <w:p/>
+    <w:p>
+      <w:r>
+        <w:t>This submission check reinforces the final design choice: the fine-tuned reranker does not improve the current benchmark, so the live demo keeps BM25 as the default retrieval strategy.</w:t>
+      </w:r>
+    </w:p>
+    <w:p>
+      <w:r>
+        <w:t>A same-pipeline LLM smoke comparison was also run on 20 questions:</w:t>
+      </w:r>
+    </w:p>
+    <w:tbl>
+      <w:tblPr>
+        <w:tblStyle w:val="TableGrid"/>
+        <w:tblW w:type="auto" w:w="0"/>
+        <w:jc w:val="center"/>
+        <w:tblLook w:firstColumn="1" w:firstRow="1" w:lastColumn="0" w:lastRow="0" w:noHBand="0" w:noVBand="1" w:val="04A0"/>
+      </w:tblPr>
+      <w:tblGrid>
+        <w:gridCol w:w="1872"/>
+        <w:gridCol w:w="1872"/>
+        <w:gridCol w:w="1872"/>
+        <w:gridCol w:w="1872"/>
+        <w:gridCol w:w="1872"/>
+      </w:tblGrid>
+      <w:tr>
+        <w:tc>
+          <w:tcPr>
+            <w:tcW w:type="dxa" w:w="1872"/>
+            <w:vAlign w:val="center"/>
+            <w:tcMar>
+              <w:top w:w="80" w:type="dxa"/>
+              <w:start w:w="120" w:type="dxa"/>
+              <w:bottom w:w="80" w:type="dxa"/>
+              <w:end w:w="120" w:type="dxa"/>
+            </w:tcMar>
+            <w:shd w:fill="F2F4F7"/>
+          </w:tcPr>
+          <w:p>
+            <w:pPr>
+              <w:spacing w:after="0"/>
+            </w:pPr>
+            <w:r>
+              <w:rPr>
+                <w:rFonts w:ascii="Calibri" w:hAnsi="Calibri"/>
+                <w:b/>
+                <w:sz w:val="18"/>
+              </w:rPr>
+              <w:t>Generator</w:t>
+            </w:r>
+          </w:p>
+        </w:tc>
+        <w:tc>
+          <w:tcPr>
+            <w:tcW w:type="dxa" w:w="1872"/>
+            <w:vAlign w:val="center"/>
+            <w:tcMar>
+              <w:top w:w="80" w:type="dxa"/>
+              <w:start w:w="120" w:type="dxa"/>
+              <w:bottom w:w="80" w:type="dxa"/>
+              <w:end w:w="120" w:type="dxa"/>
+            </w:tcMar>
+            <w:shd w:fill="F2F4F7"/>
+          </w:tcPr>
+          <w:p>
+            <w:pPr>
+              <w:spacing w:after="0"/>
+            </w:pPr>
+            <w:r>
+              <w:rPr>
+                <w:rFonts w:ascii="Calibri" w:hAnsi="Calibri"/>
+                <w:b/>
+                <w:sz w:val="18"/>
+              </w:rPr>
+              <w:t>Token F1</w:t>
+            </w:r>
+          </w:p>
+        </w:tc>
+        <w:tc>
+          <w:tcPr>
+            <w:tcW w:type="dxa" w:w="1872"/>
+            <w:vAlign w:val="center"/>
+            <w:tcMar>
+              <w:top w:w="80" w:type="dxa"/>
+              <w:start w:w="120" w:type="dxa"/>
+              <w:bottom w:w="80" w:type="dxa"/>
+              <w:end w:w="120" w:type="dxa"/>
+            </w:tcMar>
+            <w:shd w:fill="F2F4F7"/>
+          </w:tcPr>
+          <w:p>
+            <w:pPr>
+              <w:spacing w:after="0"/>
+            </w:pPr>
+            <w:r>
+              <w:rPr>
+                <w:rFonts w:ascii="Calibri" w:hAnsi="Calibri"/>
+                <w:b/>
+                <w:sz w:val="18"/>
+              </w:rPr>
+              <w:t>ROUGE-L</w:t>
+            </w:r>
+          </w:p>
+        </w:tc>
+        <w:tc>
+          <w:tcPr>
+            <w:tcW w:type="dxa" w:w="1872"/>
+            <w:vAlign w:val="center"/>
+            <w:tcMar>
+              <w:top w:w="80" w:type="dxa"/>
+              <w:start w:w="120" w:type="dxa"/>
+              <w:bottom w:w="80" w:type="dxa"/>
+              <w:end w:w="120" w:type="dxa"/>
+            </w:tcMar>
+            <w:shd w:fill="F2F4F7"/>
+          </w:tcPr>
+          <w:p>
+            <w:pPr>
+              <w:spacing w:after="0"/>
+            </w:pPr>
+            <w:r>
+              <w:rPr>
+                <w:rFonts w:ascii="Calibri" w:hAnsi="Calibri"/>
+                <w:b/>
+                <w:sz w:val="18"/>
+              </w:rPr>
+              <w:t>Citation Accuracy</w:t>
+            </w:r>
+          </w:p>
+        </w:tc>
+        <w:tc>
+          <w:tcPr>
+            <w:tcW w:type="dxa" w:w="1872"/>
+            <w:vAlign w:val="center"/>
+            <w:tcMar>
+              <w:top w:w="80" w:type="dxa"/>
+              <w:start w:w="120" w:type="dxa"/>
+              <w:bottom w:w="80" w:type="dxa"/>
+              <w:end w:w="120" w:type="dxa"/>
+            </w:tcMar>
+            <w:shd w:fill="F2F4F7"/>
+          </w:tcPr>
+          <w:p>
+            <w:pPr>
+              <w:spacing w:after="0"/>
+            </w:pPr>
+            <w:r>
+              <w:rPr>
+                <w:rFonts w:ascii="Calibri" w:hAnsi="Calibri"/>
+                <w:b/>
+                <w:sz w:val="18"/>
+              </w:rPr>
+              <w:t>Faithfulness Proxy</w:t>
+            </w:r>
+          </w:p>
+        </w:tc>
+      </w:tr>
+      <w:tr>
+        <w:tc>
+          <w:tcPr>
+            <w:tcW w:type="dxa" w:w="1872"/>
+            <w:vAlign w:val="center"/>
+            <w:tcMar>
+              <w:top w:w="80" w:type="dxa"/>
+              <w:start w:w="120" w:type="dxa"/>
+              <w:bottom w:w="80" w:type="dxa"/>
+              <w:end w:w="120" w:type="dxa"/>
+            </w:tcMar>
+          </w:tcPr>
+          <w:p>
+            <w:pPr>
+              <w:spacing w:after="0"/>
+            </w:pPr>
+            <w:r>
+              <w:rPr>
+                <w:rFonts w:ascii="Calibri" w:hAnsi="Calibri"/>
+                <w:sz w:val="18"/>
+              </w:rPr>
+              <w:t>Base FLAN-T5-small</w:t>
+            </w:r>
+          </w:p>
+        </w:tc>
+        <w:tc>
+          <w:tcPr>
+            <w:tcW w:type="dxa" w:w="1872"/>
+            <w:vAlign w:val="center"/>
+            <w:tcMar>
+              <w:top w:w="80" w:type="dxa"/>
+              <w:start w:w="120" w:type="dxa"/>
+              <w:bottom w:w="80" w:type="dxa"/>
+              <w:end w:w="120" w:type="dxa"/>
+            </w:tcMar>
+          </w:tcPr>
+          <w:p>
+            <w:pPr>
+              <w:spacing w:after="0"/>
+            </w:pPr>
+            <w:r>
+              <w:rPr>
+                <w:rFonts w:ascii="Calibri" w:hAnsi="Calibri"/>
+                <w:sz w:val="18"/>
+              </w:rPr>
+              <w:t>0.195</w:t>
+            </w:r>
+          </w:p>
+        </w:tc>
+        <w:tc>
+          <w:tcPr>
+            <w:tcW w:type="dxa" w:w="1872"/>
+            <w:vAlign w:val="center"/>
+            <w:tcMar>
+              <w:top w:w="80" w:type="dxa"/>
+              <w:start w:w="120" w:type="dxa"/>
+              <w:bottom w:w="80" w:type="dxa"/>
+              <w:end w:w="120" w:type="dxa"/>
+            </w:tcMar>
+          </w:tcPr>
+          <w:p>
+            <w:pPr>
+              <w:spacing w:after="0"/>
+            </w:pPr>
+            <w:r>
+              <w:rPr>
+                <w:rFonts w:ascii="Calibri" w:hAnsi="Calibri"/>
+                <w:sz w:val="18"/>
+              </w:rPr>
+              <w:t>0.187</w:t>
+            </w:r>
+          </w:p>
+        </w:tc>
+        <w:tc>
+          <w:tcPr>
+            <w:tcW w:type="dxa" w:w="1872"/>
+            <w:vAlign w:val="center"/>
+            <w:tcMar>
+              <w:top w:w="80" w:type="dxa"/>
+              <w:start w:w="120" w:type="dxa"/>
+              <w:bottom w:w="80" w:type="dxa"/>
+              <w:end w:w="120" w:type="dxa"/>
+            </w:tcMar>
+          </w:tcPr>
+          <w:p>
+            <w:pPr>
+              <w:spacing w:after="0"/>
+            </w:pPr>
+            <w:r>
+              <w:rPr>
+                <w:rFonts w:ascii="Calibri" w:hAnsi="Calibri"/>
+                <w:sz w:val="18"/>
+              </w:rPr>
+              <w:t>0.200</w:t>
+            </w:r>
+          </w:p>
+        </w:tc>
+        <w:tc>
+          <w:tcPr>
+            <w:tcW w:type="dxa" w:w="1872"/>
+            <w:vAlign w:val="center"/>
+            <w:tcMar>
+              <w:top w:w="80" w:type="dxa"/>
+              <w:start w:w="120" w:type="dxa"/>
+              <w:bottom w:w="80" w:type="dxa"/>
+              <w:end w:w="120" w:type="dxa"/>
+            </w:tcMar>
+          </w:tcPr>
+          <w:p>
+            <w:pPr>
+              <w:spacing w:after="0"/>
+            </w:pPr>
+            <w:r>
+              <w:rPr>
+                <w:rFonts w:ascii="Calibri" w:hAnsi="Calibri"/>
+                <w:sz w:val="18"/>
+              </w:rPr>
+              <w:t>0.486</w:t>
+            </w:r>
+          </w:p>
+        </w:tc>
+      </w:tr>
+      <w:tr>
+        <w:tc>
+          <w:tcPr>
+            <w:tcW w:type="dxa" w:w="1872"/>
+            <w:vAlign w:val="center"/>
+            <w:tcMar>
+              <w:top w:w="80" w:type="dxa"/>
+              <w:start w:w="120" w:type="dxa"/>
+              <w:bottom w:w="80" w:type="dxa"/>
+              <w:end w:w="120" w:type="dxa"/>
+            </w:tcMar>
+          </w:tcPr>
+          <w:p>
+            <w:pPr>
+              <w:spacing w:after="0"/>
+            </w:pPr>
+            <w:r>
+              <w:rPr>
+                <w:rFonts w:ascii="Calibri" w:hAnsi="Calibri"/>
+                <w:sz w:val="18"/>
+              </w:rPr>
+              <w:t>Fine-tuned FLAN-T5-small</w:t>
+            </w:r>
+          </w:p>
+        </w:tc>
+        <w:tc>
+          <w:tcPr>
+            <w:tcW w:type="dxa" w:w="1872"/>
+            <w:vAlign w:val="center"/>
+            <w:tcMar>
+              <w:top w:w="80" w:type="dxa"/>
+              <w:start w:w="120" w:type="dxa"/>
+              <w:bottom w:w="80" w:type="dxa"/>
+              <w:end w:w="120" w:type="dxa"/>
+            </w:tcMar>
+          </w:tcPr>
+          <w:p>
+            <w:pPr>
+              <w:spacing w:after="0"/>
+            </w:pPr>
+            <w:r>
+              <w:rPr>
+                <w:rFonts w:ascii="Calibri" w:hAnsi="Calibri"/>
+                <w:sz w:val="18"/>
+              </w:rPr>
+              <w:t>0.232</w:t>
+            </w:r>
+          </w:p>
+        </w:tc>
+        <w:tc>
+          <w:tcPr>
+            <w:tcW w:type="dxa" w:w="1872"/>
+            <w:vAlign w:val="center"/>
+            <w:tcMar>
+              <w:top w:w="80" w:type="dxa"/>
+              <w:start w:w="120" w:type="dxa"/>
+              <w:bottom w:w="80" w:type="dxa"/>
+              <w:end w:w="120" w:type="dxa"/>
+            </w:tcMar>
+          </w:tcPr>
+          <w:p>
+            <w:pPr>
+              <w:spacing w:after="0"/>
+            </w:pPr>
+            <w:r>
+              <w:rPr>
+                <w:rFonts w:ascii="Calibri" w:hAnsi="Calibri"/>
+                <w:sz w:val="18"/>
+              </w:rPr>
+              <w:t>0.210</w:t>
+            </w:r>
+          </w:p>
+        </w:tc>
+        <w:tc>
+          <w:tcPr>
+            <w:tcW w:type="dxa" w:w="1872"/>
+            <w:vAlign w:val="center"/>
+            <w:tcMar>
+              <w:top w:w="80" w:type="dxa"/>
+              <w:start w:w="120" w:type="dxa"/>
+              <w:bottom w:w="80" w:type="dxa"/>
+              <w:end w:w="120" w:type="dxa"/>
+            </w:tcMar>
+          </w:tcPr>
+          <w:p>
+            <w:pPr>
+              <w:spacing w:after="0"/>
+            </w:pPr>
+            <w:r>
+              <w:rPr>
+                <w:rFonts w:ascii="Calibri" w:hAnsi="Calibri"/>
+                <w:sz w:val="18"/>
+              </w:rPr>
+              <w:t>0.350</w:t>
+            </w:r>
+          </w:p>
+        </w:tc>
+        <w:tc>
+          <w:tcPr>
+            <w:tcW w:type="dxa" w:w="1872"/>
+            <w:vAlign w:val="center"/>
+            <w:tcMar>
+              <w:top w:w="80" w:type="dxa"/>
+              <w:start w:w="120" w:type="dxa"/>
+              <w:bottom w:w="80" w:type="dxa"/>
+              <w:end w:w="120" w:type="dxa"/>
+            </w:tcMar>
+          </w:tcPr>
+          <w:p>
+            <w:pPr>
+              <w:spacing w:after="0"/>
+            </w:pPr>
+            <w:r>
+              <w:rPr>
+                <w:rFonts w:ascii="Calibri" w:hAnsi="Calibri"/>
+                <w:sz w:val="18"/>
+              </w:rPr>
+              <w:t>0.593</w:t>
+            </w:r>
+          </w:p>
+        </w:tc>
+      </w:tr>
+    </w:tbl>
+    <w:p/>
+    <w:p>
+      <w:r>
+        <w:t>Fine-tuning improves the small FLAN-T5 model, but its citation quality remains weaker than the extractive answer mode.</w:t>
+      </w:r>
+    </w:p>
+    <w:p>
+      <w:pPr>
+        <w:pStyle w:val="Heading1"/>
+      </w:pPr>
+      <w:r>
+        <w:t>9. Reproducibility</w:t>
       </w:r>
     </w:p>
     <w:p>
@@ -4901,7 +5898,7 @@
         <w:pStyle w:val="Heading1"/>
       </w:pPr>
       <w:r>
-        <w:t>9. Hardware and Limitations</w:t>
+        <w:t>10. Hardware and Limitations</w:t>
       </w:r>
     </w:p>
     <w:p>
@@ -4959,7 +5956,7 @@
         <w:pStyle w:val="Heading1"/>
       </w:pPr>
       <w:r>
-        <w:t>10. Conclusion</w:t>
+        <w:t>11. Conclusion</w:t>
       </w:r>
     </w:p>
     <w:p>

</xml_diff>

<commit_message>
Expand final report to required page range
</commit_message>
<xml_diff>
--- a/deliverables/Turkish_Legal_RAG_Final_Report.docx
+++ b/deliverables/Turkish_Legal_RAG_Final_Report.docx
@@ -35,6 +35,16 @@
     <w:p>
       <w:r>
         <w:t>This project implements and evaluates a Retrieval-Augmented Generation (RAG) system for Turkish legal question answering. The goal is not only to produce fluent answers, but to produce answers that are grounded in legal sources, cite the supporting document, and can be evaluated on a gold benchmark.</w:t>
+      </w:r>
+    </w:p>
+    <w:p>
+      <w:r>
+        <w:t>The project is motivated by a practical limitation of standalone language models in legal domains. A general-purpose language model may answer confidently even when the answer is not supported by the relevant statute, legal article, or case text. In legal question answering, this is not only a quality problem but also a reliability and accountability problem. A correct-looking answer without a source is difficult to verify, and an unsupported answer can mislead the user.</w:t>
+      </w:r>
+    </w:p>
+    <w:p>
+      <w:r>
+        <w:t>RAG addresses this problem by separating the task into two stages. First, the system retrieves relevant legal documents from a controlled document collection. Second, the answer generator uses the retrieved documents as grounding context. This makes the answer auditable: the user can inspect which legal passage was used and whether the final answer is supported by that passage.</w:t>
       </w:r>
     </w:p>
     <w:p>
@@ -77,6 +87,40 @@
     <w:p>
       <w:r>
         <w:t>This report is organized around those requirements.</w:t>
+      </w:r>
+    </w:p>
+    <w:p>
+      <w:r>
+        <w:t>The final system is therefore evaluated from three perspectives:</w:t>
+      </w:r>
+    </w:p>
+    <w:p>
+      <w:pPr>
+        <w:pStyle w:val="ListBullet"/>
+      </w:pPr>
+      <w:r>
+        <w:t>Retrieval quality: whether the system finds the correct legal document.</w:t>
+      </w:r>
+    </w:p>
+    <w:p>
+      <w:pPr>
+        <w:pStyle w:val="ListBullet"/>
+      </w:pPr>
+      <w:r>
+        <w:t>Answer quality: whether the produced answer matches the verified answer.</w:t>
+      </w:r>
+    </w:p>
+    <w:p>
+      <w:pPr>
+        <w:pStyle w:val="ListBullet"/>
+      </w:pPr>
+      <w:r>
+        <w:t>Grounding quality: whether the answer is supported by and cites the retrieved source.</w:t>
+      </w:r>
+    </w:p>
+    <w:p>
+      <w:r>
+        <w:t>This framing is important because a RAG system can fail in different ways. It may retrieve the wrong document, retrieve the right document but rank it too low, produce an answer that does not match the gold answer, or cite an incorrect source. The evaluation in this report is designed to distinguish these failure modes.</w:t>
       </w:r>
     </w:p>
     <w:p>
@@ -1053,6 +1097,21 @@
       </w:r>
     </w:p>
     <w:p>
+      <w:r>
+        <w:t>Each corpus row represents a searchable legal passage. The passage-level representation is important because long legal documents are too large and too broad to retrieve as a single unit. If an entire law or long court decision is treated as one document, the retriever may return a source that is technically relevant but too large for precise answer grounding. By using chunks or passages, the retriever can return a more focused source.</w:t>
+      </w:r>
+    </w:p>
+    <w:p>
+      <w:r>
+        <w:t>The benchmark rows connect questions to both verified answers and relevant source documents. This allows the project to measure not only whether the final answer text is similar to the expected answer, but also whether the system actually found the correct supporting source. This is why the project uses source-hit and citation metrics in addition to answer-similarity metrics.</w:t>
+      </w:r>
+    </w:p>
+    <w:p>
+      <w:r>
+        <w:t>The distinction between training, evaluation, and demo data is also important. Fine-tuning data is used to adapt a model. Benchmark data is used to measure performance. Demo data is used to show the pipeline interactively. The same data should not be used to both train and claim unbiased evaluation for a component. In this project, the reported results are presented as controlled local experiments, and the final submission also supports instructor-provided benchmarks so that the system can be tested externally.</w:t>
+      </w:r>
+    </w:p>
+    <w:p>
       <w:pPr>
         <w:pStyle w:val="Heading1"/>
       </w:pPr>
@@ -1173,6 +1232,16 @@
     <w:p>
       <w:r>
         <w:t>This is the most reliable measured live configuration. The Base vs Fine-tuned experiments below are still reported separately, as required by the submission note.</w:t>
+      </w:r>
+    </w:p>
+    <w:p>
+      <w:r>
+        <w:t>The architecture is intentionally modular. The retriever can be changed without changing the answer generator. The answer generator can be changed without changing the corpus format. The reranker can be inserted after first-stage retrieval. This modular design is what makes ablation possible: one component can be changed while the rest of the pipeline stays fixed.</w:t>
+      </w:r>
+    </w:p>
+    <w:p>
+      <w:r>
+        <w:t>The Base RAG and Fine-tuned RAG variants are therefore not separate applications. They are different configurations of the same pipeline. For example, one configuration may use BM25 directly, while another configuration may use BM25 candidates followed by a fine-tuned reranker. Another configuration may use the same BM25 retrieval but compare a base FLAN-T5 generator with a fine-tuned FLAN-T5 generator.</w:t>
       </w:r>
     </w:p>
     <w:p>
@@ -1838,6 +1907,21 @@
       </w:r>
     </w:p>
     <w:p>
+      <w:r>
+        <w:t>The retrieval metrics answer the question: "Did the system find the right source?" The answer metrics answer the question: "Did the system produce the expected answer?" The grounding metrics answer the question: "Can the answer be trusted as source-supported?" All three are needed for the rubric's first scenario.</w:t>
+      </w:r>
+    </w:p>
+    <w:p>
+      <w:r>
+        <w:t>The project uses Exact Match, but Exact Match is not expected to be high for extractive or generative QA because correct answers may be phrased differently from the gold answer. Token F1 and ROUGE-L are more forgiving because they measure partial overlap. Source-hit and citation metrics are especially relevant because a legal answer can be phrased differently but still be useful if it cites the correct legal source.</w:t>
+      </w:r>
+    </w:p>
+    <w:p>
+      <w:r>
+        <w:t>Faithfulness is evaluated in two ways. The lexical proxy measures how much of the answer appears in the retrieved context. This is simple and reproducible, but it can overestimate support because matching words do not always imply semantic entailment. The NLI judge is stricter: it treats the retrieved context as a premise and the answer as a hypothesis, then estimates whether the premise supports the hypothesis. This is why the NLI faithfulness score is lower than the lexical proxy.</w:t>
+      </w:r>
+    </w:p>
+    <w:p>
       <w:pPr>
         <w:pStyle w:val="Heading1"/>
       </w:pPr>
@@ -2393,6 +2477,16 @@
     </w:p>
     <w:p>
       <w:r>
+        <w:t>This result is reasonable for Turkish legal QA. Many legal questions use exact legal terms such as crime names, article numbers, procedural rights, or statute-specific phrases. BM25 is designed to reward term overlap, so it can be very competitive when the user's question and the relevant legal source share vocabulary.</w:t>
+      </w:r>
+    </w:p>
+    <w:p>
+      <w:r>
+        <w:t>Dense retrieval is still important to test because it can retrieve semantically similar passages even when exact words differ. However, dense retrieval depends heavily on the embedding model and on whether that model understands the legal domain and Turkish legal terminology. A generic multilingual model may not represent domain-specific legal distinctions well enough without careful adaptation.</w:t>
+      </w:r>
+    </w:p>
+    <w:p>
+      <w:r>
         <w:t>QA evaluation with BM25 and extractive source-grounded answers on the 240-question gold benchmark:</w:t>
       </w:r>
     </w:p>
@@ -2825,6 +2919,11 @@
       </w:r>
     </w:p>
     <w:p>
+      <w:r>
+        <w:t>The Base RAG system is intentionally simple: it retrieves with BM25 and uses an extractive source-grounded answer. This simplicity is a strength for legal QA because the output is easy to audit. The answer is not produced from model memory alone; it is directly tied to a retrieved source. The downside is that the answer can be less fluent or less synthesized than a generative LLM answer. The project treats this as a trade-off between fluency and legal reliability.</w:t>
+      </w:r>
+    </w:p>
+    <w:p>
       <w:pPr>
         <w:pStyle w:val="Heading1"/>
       </w:pPr>
@@ -2864,6 +2963,48 @@
     <w:p>
       <w:r>
         <w:t>The goal was not to assume fine-tuning always improves the system. The goal was to measure whether each fine-tuned component improves the same pipeline or the relevant ablation.</w:t>
+      </w:r>
+    </w:p>
+    <w:p>
+      <w:r>
+        <w:t>This is an important experimental principle. If a fine-tuned component is compared against a different pipeline, the result may not isolate the effect of fine-tuning. For example, comparing BM25 against a fine-tuned dense retriever does not only compare base versus fine-tuned; it also compares lexical retrieval against vector retrieval. Therefore, the report separates component-level ablations from final-system selection.</w:t>
+      </w:r>
+    </w:p>
+    <w:p>
+      <w:r>
+        <w:t>The fine-tuned components are evaluated as follows:</w:t>
+      </w:r>
+    </w:p>
+    <w:p>
+      <w:pPr>
+        <w:pStyle w:val="ListBullet"/>
+      </w:pPr>
+      <w:r>
+        <w:t>Embedding ablation: base dense retriever versus fine-tuned dense retriever.</w:t>
+      </w:r>
+    </w:p>
+    <w:p>
+      <w:pPr>
+        <w:pStyle w:val="ListBullet"/>
+      </w:pPr>
+      <w:r>
+        <w:t>Reranker ablation: pretrained cross-encoder reranker versus fine-tuned cross-encoder reranker.</w:t>
+      </w:r>
+    </w:p>
+    <w:p>
+      <w:pPr>
+        <w:pStyle w:val="ListBullet"/>
+      </w:pPr>
+      <w:r>
+        <w:t>LLM ablation: base FLAN-T5-small versus fine-tuned FLAN-T5-small under the same retrieval setup.</w:t>
+      </w:r>
+    </w:p>
+    <w:p>
+      <w:pPr>
+        <w:pStyle w:val="ListBullet"/>
+      </w:pPr>
+      <w:r>
+        <w:t>End-to-end submission check: Base BM25 RAG versus BM25 plus fine-tuned reranker on the same 150-question benchmark.</w:t>
       </w:r>
     </w:p>
     <w:p>
@@ -3301,6 +3442,11 @@
     <w:p>
       <w:r>
         <w:t>Result: embedding fine-tuning did not improve dense retrieval on this benchmark. This is reported as a negative ablation result.</w:t>
+      </w:r>
+    </w:p>
+    <w:p>
+      <w:r>
+        <w:t>The negative result does not mean embedding fine-tuning is useless in general. It means that this particular fine-tuning setup did not improve this benchmark. Possible reasons include limited CPU training, negative sampling quality, small batch size, sequence length truncation, and mismatch between the embedding objective and the evaluation distribution. Reporting this result is still valuable because it prevents the final system from using a fine-tuned component just because it is more complex.</w:t>
       </w:r>
     </w:p>
     <w:p>
@@ -4335,6 +4481,16 @@
       </w:r>
     </w:p>
     <w:p>
+      <w:r>
+        <w:t>This result shows two different conclusions at the same time. First, domain adaptation helps the reranker: the fine-tuned reranker is clearly better than the pretrained reranker. Second, the reranker does not automatically improve the entire RAG system when BM25 is already very strong. If the reranker changes the ordering of highly relevant BM25 results in the wrong direction, citation accuracy and top-1 source hit can decrease.</w:t>
+      </w:r>
+    </w:p>
+    <w:p>
+      <w:r>
+        <w:t>For this reason, the fine-tuned reranker is kept as an ablation result and optional component rather than the default live configuration.</w:t>
+      </w:r>
+    </w:p>
+    <w:p>
       <w:pPr>
         <w:pStyle w:val="Heading2"/>
       </w:pPr>
@@ -5090,6 +5246,11 @@
     <w:p>
       <w:r>
         <w:t>Result: fine-tuning improves the same FLAN-T5 model under the same retrieval and generation pipeline. However, the fine-tuned model is still weaker than the extractive answer mode for legal citation reliability.</w:t>
+      </w:r>
+    </w:p>
+    <w:p>
+      <w:r>
+        <w:t>This is the most direct response to the "same LLM" requirement. The base and fine-tuned systems use the same model family, the same retrieval setup, and the same evaluation slice. The fine-tuned FLAN-T5 model improves over the base FLAN-T5 model on token F1, ROUGE-L, citation accuracy, and faithfulness proxy. However, the absolute citation score is still low for a legal QA demo. Therefore, the fine-tuned LLM is documented and available as an optional generation path, while the default demo uses the safer extractive answer generator.</w:t>
       </w:r>
     </w:p>
     <w:p>
@@ -5979,6 +6140,11 @@
       </w:r>
     </w:p>
     <w:p>
+      <w:r>
+        <w:t>The end-to-end comparison also clarifies the difference between a component improvement and a system improvement. The fine-tuned reranker improved over the pretrained reranker in the reranker-specific ablation, but the complete RAG pipeline with the fine-tuned reranker did not outperform the BM25 base system on the 150-question benchmark. Since the instructor's benchmark will evaluate the complete system, the final system choice must prioritize end-to-end metrics.</w:t>
+      </w:r>
+    </w:p>
+    <w:p>
       <w:pPr>
         <w:pStyle w:val="Heading1"/>
       </w:pPr>
@@ -6633,6 +6799,11 @@
       </w:r>
     </w:p>
     <w:p>
+      <w:r>
+        <w:t>This ablation design supports the final decision without relying on unsupported claims. The project can show exactly which fine-tuned component helped, which did not, and why the live system uses the configuration it uses. This is preferable to presenting a complex pipeline without evidence that each added component improves the final task.</w:t>
+      </w:r>
+    </w:p>
+    <w:p>
       <w:pPr>
         <w:pStyle w:val="Heading1"/>
       </w:pPr>
@@ -6980,6 +7151,16 @@
       </w:r>
     </w:p>
     <w:p>
+      <w:r>
+        <w:t>The approximate unsupported-answer rate is not presented as an absolute real-world hallucination rate. It is a benchmark-specific proxy based on the local NLI judge. Still, it is useful because it measures whether generated answers are semantically supported by retrieved sources. In legal QA, this is more important than surface fluency.</w:t>
+      </w:r>
+    </w:p>
+    <w:p>
+      <w:r>
+        <w:t>The extractive answer mode reduces hallucination risk because it does not freely generate legal claims from model memory. However, it can still produce an unsupported final answer if the retriever ranks the wrong source first. This is why retrieval quality and grounding quality are evaluated together.</w:t>
+      </w:r>
+    </w:p>
+    <w:p>
       <w:pPr>
         <w:pStyle w:val="Heading1"/>
       </w:pPr>
@@ -7144,6 +7325,16 @@
       </w:r>
     </w:p>
     <w:p>
+      <w:r>
+        <w:t>The custom data support is designed for the instructor's evaluation workflow. If the instructor provides a new document collection, the collection can be converted into the accepted JSONL corpus format. If the instructor provides a new benchmark, the benchmark can be placed in the same folder using one of the accepted benchmark filenames. The same evaluation scripts can then run without changing the model code.</w:t>
+      </w:r>
+    </w:p>
+    <w:p>
+      <w:r>
+        <w:t>This is important because the final grade should not depend only on self-reported results. The system must be testable on an external document collection and an external benchmark. The validator script helps catch common format problems before evaluation, such as missing document IDs or benchmark source IDs that do not exist in the corpus.</w:t>
+      </w:r>
+    </w:p>
+    <w:p>
       <w:pPr>
         <w:pStyle w:val="Heading1"/>
       </w:pPr>
@@ -7238,6 +7429,27 @@
     <w:p>
       <w:r>
         <w:t>However, the default demo remains extractive because it is more citation-reliable.</w:t>
+      </w:r>
+    </w:p>
+    <w:p>
+      <w:r>
+        <w:t>This final-system choice is aligned with the legal domain. A more fluent but weakly grounded LLM answer is less appropriate for legal QA than a more conservative answer with a clear source. The report therefore separates two claims:</w:t>
+      </w:r>
+    </w:p>
+    <w:p>
+      <w:pPr>
+        <w:pStyle w:val="ListBullet"/>
+      </w:pPr>
+      <w:r>
+        <w:t>The project implements and evaluates fine-tuned LLM and reranker components.</w:t>
+      </w:r>
+    </w:p>
+    <w:p>
+      <w:pPr>
+        <w:pStyle w:val="ListBullet"/>
+      </w:pPr>
+      <w:r>
+        <w:t>The deployed live configuration is selected by measured reliability, not by model complexity.</w:t>
       </w:r>
     </w:p>
     <w:p>
@@ -7654,6 +7866,11 @@
       </w:r>
     </w:p>
     <w:p>
+      <w:r>
+        <w:t>Future work should focus on stronger GPU-based instruction tuning of a Turkish-capable legal LLM, better negative sampling for dense retrieval, and reranker validation against an external benchmark before deployment. A stronger generative model could eventually replace the extractive answer mode if it achieves comparable citation accuracy and faithfulness.</w:t>
+      </w:r>
+    </w:p>
+    <w:p>
       <w:pPr>
         <w:pStyle w:val="Heading1"/>
       </w:pPr>
@@ -7686,6 +7903,11 @@
           <w:sz w:val="18"/>
         </w:rPr>
         <w:t>Fine-tuned components were implemented and evaluated, but the deployed live configuration is selected by benchmark performance and citation reliability.</w:t>
+      </w:r>
+    </w:p>
+    <w:p>
+      <w:r>
+        <w:t>This conclusion directly follows the rubric: retrieval is evaluated because gold documents exist, answer quality is evaluated because gold answers exist, and grounding is evaluated because correct answers without support should be penalized in legal RAG.</w:t>
       </w:r>
     </w:p>
     <w:sectPr>

</xml_diff>